<commit_message>
Update selected publications on profile and English CV
</commit_message>
<xml_diff>
--- a/cv/CV_Masafumi_Oizumi.docx
+++ b/cv/CV_Masafumi_Oizumi.docx
@@ -438,18 +438,7 @@
         <w:spacing w:before="400" w:after="200"/>
       </w:pPr>
       <w:r>
-        <w:t>PUBLICATIONS</w:t>
-      </w:r>
-    </w:p>
-    <w:p>
-      <w:pPr>
-        <w:pStyle w:val="Heading2"/>
-        <w:keepNext/>
-        <w:widowControl/>
-        <w:spacing w:before="280" w:after="200"/>
-      </w:pPr>
-      <w:r>
-        <w:t>Published or in Press</w:t>
+        <w:t>Selected Publications</w:t>
       </w:r>
     </w:p>
     <w:p>
@@ -460,7 +449,7 @@
         <w:ind w:left="432" w:hanging="432"/>
       </w:pPr>
       <w:r>
-        <w:t>60. Tamami Nakano, Satoe Awada, Masafumi Oizumi, Daisuke Kuwano, Kazuyo Tanji, Nobumasa Kato, Noburo Saji (2026)</w:t>
+        <w:t>12. Daiki Sekizawa, Sosuke Ito, Masafumi Oizumi (2026)</w:t>
       </w:r>
     </w:p>
     <w:p>
@@ -471,7 +460,7 @@
         <w:ind w:left="432"/>
       </w:pPr>
       <w:r>
-        <w:t>Atypical Tactile Expressions Using Japanese Ideophones in Adults With Autism Spectrum Disorders.</w:t>
+        <w:t>Koopman Mode Decomposition of Thermodynamic Dissipation in Nonlinear Langevin Dynamics.</w:t>
       </w:r>
     </w:p>
     <w:p>
@@ -482,7 +471,7 @@
         <w:ind w:left="432"/>
       </w:pPr>
       <w:r>
-        <w:t xml:space="preserve">Journal of Autism and Developmental Disorders, advance online publication. </w:t>
+        <w:t xml:space="preserve">Proceedings of the National Academy of Sciences, 123(25), e2530617123. </w:t>
       </w:r>
       <w:hyperlink r:id="rId11">
         <w:r>
@@ -503,7 +492,7 @@
         <w:ind w:left="432" w:hanging="432"/>
       </w:pPr>
       <w:r>
-        <w:t>59. Ken Takeda, Masafumi Oizumi, Ryo Karakida (2026)</w:t>
+        <w:t>11. Masafumi Oizumi, Chanseok Lim, Ryota Kanai (2026)</w:t>
       </w:r>
     </w:p>
     <w:p>
@@ -514,7 +503,7 @@
         <w:ind w:left="432"/>
       </w:pPr>
       <w:r>
-        <w:t>Continual Learning in Modern Hopfield Networks with an Application to Diffusion Models.</w:t>
+        <w:t>Principal bundle geometry of qualia: Understanding the quality of consciousness from symmetry.</w:t>
       </w:r>
     </w:p>
     <w:p>
@@ -525,7 +514,7 @@
         <w:ind w:left="432"/>
       </w:pPr>
       <w:r>
-        <w:t xml:space="preserve">Advances in Neural Information Processing Systems (NeurIPS), in press. </w:t>
+        <w:t xml:space="preserve">PNAS Nexus, 5(9), pgag261. </w:t>
       </w:r>
       <w:hyperlink r:id="rId12">
         <w:r>
@@ -546,7 +535,7 @@
         <w:ind w:left="432" w:hanging="432"/>
       </w:pPr>
       <w:r>
-        <w:t>58. Soh Takahashi*, Masaru Sasaki*, Ken Takeda, Masafumi Oizumi (2026)</w:t>
+        <w:t>10. Daiki Kiyooka*, Ikumi Oomoto*, Jun Kitazono, Yoshihito Saito, Midori Kobayashi, Chie Matsubara, Kenta Kobayashi, Masanori Murayama**, Masafumi Oizumi** (2026)</w:t>
       </w:r>
     </w:p>
     <w:p>
@@ -557,7 +546,7 @@
         <w:ind w:left="432"/>
       </w:pPr>
       <w:r>
-        <w:t>Investigating Fine- and Coarse-grained Structural Correspondences Between Deep Neural Networks and Human Object Image Similarity Judgments Using Unsupervised Alignment.</w:t>
+        <w:t>Single-cell resolution functional networks during unconsciousness are segregated into spatially intermixed modules.</w:t>
       </w:r>
     </w:p>
     <w:p>
@@ -568,7 +557,7 @@
         <w:ind w:left="432"/>
       </w:pPr>
       <w:r>
-        <w:t xml:space="preserve">Neural Networks, 195, 108222. *: equal contribution. </w:t>
+        <w:t xml:space="preserve">Cell Reports, 45(2), 116902. *, **: equal contribution </w:t>
       </w:r>
       <w:hyperlink r:id="rId13">
         <w:r>
@@ -589,7 +578,7 @@
         <w:ind w:left="432" w:hanging="432"/>
       </w:pPr>
       <w:r>
-        <w:t>57. Daiki Sekizawa, Sosuke Ito, Masafumi Oizumi (2026)</w:t>
+        <w:t>9. Genji Kawakita*, Ariel Zeleznikow-Johnston*, Ken Takeda*, Naotsugu Tsuchiya**, Masafumi Oizumi** (2025)</w:t>
       </w:r>
     </w:p>
     <w:p>
@@ -600,7 +589,7 @@
         <w:ind w:left="432"/>
       </w:pPr>
       <w:r>
-        <w:t>Koopman Mode Decomposition of Thermodynamic Dissipation in Nonlinear Langevin Dynamics.</w:t>
+        <w:t>Is my "red" your "red"?: Evaluating structural correspondences between color similarity judgments using unsupervised alignment.</w:t>
       </w:r>
     </w:p>
     <w:p>
@@ -611,7 +600,7 @@
         <w:ind w:left="432"/>
       </w:pPr>
       <w:r>
-        <w:t xml:space="preserve">Proceedings of the National Academy of Sciences, 123(25), e2530617123. </w:t>
+        <w:t xml:space="preserve">iScience, 28, 3, 112029. *, **: equal contribution </w:t>
       </w:r>
       <w:hyperlink r:id="rId14">
         <w:r>
@@ -632,7 +621,7 @@
         <w:ind w:left="432" w:hanging="432"/>
       </w:pPr>
       <w:r>
-        <w:t>56. Ikumi Oomoto, Daiki Kiyooka, Masafumi Oizumi, Masanori Murayama (2026)</w:t>
+        <w:t>8. Ken Takeda*, Masaru Sasaki*, Kota Abe, Masafumi Oizumi (2025)</w:t>
       </w:r>
     </w:p>
     <w:p>
@@ -643,7 +632,7 @@
         <w:ind w:left="432"/>
       </w:pPr>
       <w:r>
-        <w:t>Multi-area single-cell calcium imaging dataset of the mouse cortex across wakefulness, sleep, and anesthesia.</w:t>
+        <w:t>Unsupervised Alignment in Neuroscience: Introducing a Toolbox for Gromov-Wasserstein Optimal Transport.</w:t>
       </w:r>
     </w:p>
     <w:p>
@@ -654,7 +643,7 @@
         <w:ind w:left="432"/>
       </w:pPr>
       <w:r>
-        <w:t xml:space="preserve">Scientific Data, advance online publication. </w:t>
+        <w:t xml:space="preserve">Journal of Neuroscience Methods, 419, 110443. *: equal contribution. The Toolbox is available on </w:t>
       </w:r>
       <w:hyperlink r:id="rId15">
         <w:r>
@@ -662,42 +651,11 @@
             <w:color w:val="1155CC"/>
             <w:u w:val="single"/>
           </w:rPr>
-          <w:t>DOI</w:t>
+          <w:t>GitHub</w:t>
         </w:r>
       </w:hyperlink>
-      <w:r/>
-    </w:p>
-    <w:p>
-      <w:pPr>
-        <w:keepNext/>
-        <w:keepLines/>
-        <w:widowControl/>
-        <w:ind w:left="432" w:hanging="432"/>
-      </w:pPr>
-      <w:r>
-        <w:t>55. Masafumi Oizumi, Chanseok Lim, Ryota Kanai (2026)</w:t>
-      </w:r>
-    </w:p>
-    <w:p>
-      <w:pPr>
-        <w:keepNext/>
-        <w:keepLines/>
-        <w:widowControl/>
-        <w:ind w:left="432"/>
-      </w:pPr>
-      <w:r>
-        <w:t>Principal bundle geometry of qualia: Understanding the quality of consciousness from symmetry.</w:t>
-      </w:r>
-    </w:p>
-    <w:p>
-      <w:pPr>
-        <w:keepLines/>
-        <w:widowControl/>
-        <w:spacing w:after="240"/>
-        <w:ind w:left="432"/>
-      </w:pPr>
-      <w:r>
-        <w:t xml:space="preserve">PNAS Nexus, 5(9), pgag261. </w:t>
+      <w:r>
+        <w:t xml:space="preserve"> </w:t>
       </w:r>
       <w:hyperlink r:id="rId16">
         <w:r>
@@ -718,7 +676,7 @@
         <w:ind w:left="432" w:hanging="432"/>
       </w:pPr>
       <w:r>
-        <w:t>54. Yumi Shikauchi, Mitsuaki Takemi, Leo Tomasevic, Jun Kitazono, Hartwig R. Siebner, and Masafumi Oizumi (2026)</w:t>
+        <w:t>7. Daiki Sekizawa, Sosuke Ito, Masafumi Oizumi (2024)</w:t>
       </w:r>
     </w:p>
     <w:p>
@@ -729,7 +687,7 @@
         <w:ind w:left="432"/>
       </w:pPr>
       <w:r>
-        <w:t>Quantifying state-dependent control properties of brain dynamics from perturbation responses.</w:t>
+        <w:t>Decomposing thermodynamic dissipation of linear Langevin systems via oscillatory modes and its application to neural dynamics.</w:t>
       </w:r>
     </w:p>
     <w:p>
@@ -740,7 +698,7 @@
         <w:ind w:left="432"/>
       </w:pPr>
       <w:r>
-        <w:t xml:space="preserve">The Journal of Neuroscience, 46(5), e0364252025. </w:t>
+        <w:t xml:space="preserve">Physical Review X 14 (4), 041003. </w:t>
       </w:r>
       <w:hyperlink r:id="rId17">
         <w:r>
@@ -761,7 +719,7 @@
         <w:ind w:left="432" w:hanging="432"/>
       </w:pPr>
       <w:r>
-        <w:t>53. Daiki Kiyooka*, Ikumi Oomoto*, Jun Kitazono, Yoshihito Saito, Midori Kobayashi, Chie Matsubara, Kenta Kobayashi, Masanori Murayama**, Masafumi Oizumi** (2026)</w:t>
+        <w:t>6. Jun Kitazono, Yuma Aoki, Masafumi Oizumi (2023)</w:t>
       </w:r>
     </w:p>
     <w:p>
@@ -772,7 +730,7 @@
         <w:ind w:left="432"/>
       </w:pPr>
       <w:r>
-        <w:t>Single-cell resolution functional networks during unconsciousness are segregated into spatially intermixed modules.</w:t>
+        <w:t>Bidirectionally connected cores in a mouse connectome: Towards extracting the brain subnetworks essential for consciousness.</w:t>
       </w:r>
     </w:p>
     <w:p>
@@ -783,7 +741,7 @@
         <w:ind w:left="432"/>
       </w:pPr>
       <w:r>
-        <w:t xml:space="preserve">Cell Reports, 45(2), 116902. *, **: equal contribution </w:t>
+        <w:t xml:space="preserve">Cerebral Cortex, 33(4), 1383-1402. </w:t>
       </w:r>
       <w:hyperlink r:id="rId18">
         <w:r>
@@ -804,7 +762,7 @@
         <w:ind w:left="432" w:hanging="432"/>
       </w:pPr>
       <w:r>
-        <w:t>52. Tomoya Taguchi, Jun Kitazono, Shuntaro Sasai, Masafumi Oizumi (2025)</w:t>
+        <w:t>5. Shunsuke Kamiya, Genji Kawakita, Shuntaro Sasai, Jun Kitazono, Masafumi Oizumi (2023)</w:t>
       </w:r>
     </w:p>
     <w:p>
@@ -815,7 +773,7 @@
         <w:ind w:left="432"/>
       </w:pPr>
       <w:r>
-        <w:t>Association of bidirectional network cores in the brain with perceptual awareness and cognition.</w:t>
+        <w:t>Optimal Control Costs of Brain State Transitions in Linear Stochastic Systems.</w:t>
       </w:r>
     </w:p>
     <w:p>
@@ -826,7 +784,7 @@
         <w:ind w:left="432"/>
       </w:pPr>
       <w:r>
-        <w:t xml:space="preserve">The Journal of Neuroscience, 45(17), e0802242025. </w:t>
+        <w:t xml:space="preserve">The Journal of Neuroscience, 43 (2), 270-281. </w:t>
       </w:r>
       <w:hyperlink r:id="rId19">
         <w:r>
@@ -847,7 +805,7 @@
         <w:ind w:left="432" w:hanging="432"/>
       </w:pPr>
       <w:r>
-        <w:t>51. Tononi G, Albantakis L, Barbosa L, Boly M, Cirelli C, Comolatti R, Ellia F, Findlay G, Girardi Casali A, Grasso M, Haun AM, Hendren J, Hoel E, Koch C, Maier A, Marshall W, Massimini M, Mayner WGP, Oizumi M, Szczotka J, Tsuchiya N, Zaeemzadeh A (2025)</w:t>
+        <w:t>4. Masafumi Oizumi, Shun-ichi Amari, Toru Yanagawa, Naotaka Fujii, Naotsugu Tsuchiya (2016)</w:t>
       </w:r>
     </w:p>
     <w:p>
@@ -858,7 +816,7 @@
         <w:ind w:left="432"/>
       </w:pPr>
       <w:r>
-        <w:t>Consciousness or pseudo-consciousness? A clash of two paradigms.</w:t>
+        <w:t>Measuring Integrated Information from the Decoding Perspective.</w:t>
       </w:r>
     </w:p>
     <w:p>
@@ -869,7 +827,7 @@
         <w:ind w:left="432"/>
       </w:pPr>
       <w:r>
-        <w:t xml:space="preserve">Nature Neuroscience, 28, 694–702. </w:t>
+        <w:t xml:space="preserve">PLoS Comput Biol, 12(1), e1004654. </w:t>
       </w:r>
       <w:hyperlink r:id="rId20">
         <w:r>
@@ -890,7 +848,7 @@
         <w:ind w:left="432" w:hanging="432"/>
       </w:pPr>
       <w:r>
-        <w:t>50. Tadahiro Taniguchi, Masafumi Oizumi, Noburo Saji, Takato Horii, and Naotsugu Tsuchiya (2025)</w:t>
+        <w:t>3. Masafumi Oizumi, Naotsugu Tsuchiya, Shun-ichi Amari (2016)</w:t>
       </w:r>
     </w:p>
     <w:p>
@@ -901,7 +859,7 @@
         <w:ind w:left="432"/>
       </w:pPr>
       <w:r>
-        <w:t>Constructive approach to bidirectional influence between qualia structure and language emergence.</w:t>
+        <w:t>Unified Framework for Information Integration Based on Information Geometry.</w:t>
       </w:r>
     </w:p>
     <w:p>
@@ -912,7 +870,7 @@
         <w:ind w:left="432"/>
       </w:pPr>
       <w:r>
-        <w:t xml:space="preserve">Philosophy and the Mind Sciences, 6. </w:t>
+        <w:t xml:space="preserve">Proceedings of the National Academy of Sciences, 113(51), 14817-14822. </w:t>
       </w:r>
       <w:hyperlink r:id="rId21">
         <w:r>
@@ -933,7 +891,7 @@
         <w:ind w:left="432" w:hanging="432"/>
       </w:pPr>
       <w:r>
-        <w:t>49. Haruka Asanuma, Naoko Koide-Majima, Ken Nakamura, Takato Horii, Shinji Nishimoto, Masafumi Oizumi (2025)</w:t>
+        <w:t>2. Masafumi Oizumi*, Larissa Albantakis*, Giulio Tononi (2014)</w:t>
       </w:r>
     </w:p>
     <w:p>
@@ -944,7 +902,7 @@
         <w:ind w:left="432"/>
       </w:pPr>
       <w:r>
-        <w:t>Correspondence of high dimensional emotion structures elicited from video clips between humans and multimodal LLMs.</w:t>
+        <w:t>From the Phenomenology to the Mechanisms of Consciousness: Integrated Information Theory 3.0.</w:t>
       </w:r>
     </w:p>
     <w:p>
@@ -955,7 +913,7 @@
         <w:ind w:left="432"/>
       </w:pPr>
       <w:r>
-        <w:t xml:space="preserve">Scientific Reports, 15, 32175. </w:t>
+        <w:t xml:space="preserve">PLoS Computational Biology, 10, e1003588. *: equal contribution </w:t>
       </w:r>
       <w:hyperlink r:id="rId22">
         <w:r>
@@ -976,7 +934,7 @@
         <w:ind w:left="432" w:hanging="432"/>
       </w:pPr>
       <w:r>
-        <w:t>48. Asaki Kataoka, Yoshihiro Nagano, and Masafumi Oizumi (2025)</w:t>
+        <w:t>1. Masafumi Oizumi, Toshiyuki Ishii, Kazuya Ishibashi, Toshihiko Hosoya, Masato Okada (2010)</w:t>
       </w:r>
     </w:p>
     <w:p>
@@ -987,7 +945,7 @@
         <w:ind w:left="432"/>
       </w:pPr>
       <w:r>
-        <w:t>Exploring internal representations of self-supervised networks: few-shot learning abilities and comparison with human semantics and recognition of objects.</w:t>
+        <w:t>Mismatched decoding in the brain.</w:t>
       </w:r>
     </w:p>
     <w:p>
@@ -998,7 +956,7 @@
         <w:ind w:left="432"/>
       </w:pPr>
       <w:r>
-        <w:t xml:space="preserve">Frontiers in Computational Neuroscience, 19, 1613291. </w:t>
+        <w:t xml:space="preserve">The Journal of Neuroscience, 30, 4815-4826. </w:t>
       </w:r>
       <w:hyperlink r:id="rId23">
         <w:r>
@@ -1013,13 +971,36 @@
     </w:p>
     <w:p>
       <w:pPr>
+        <w:pStyle w:val="Heading1"/>
+        <w:keepNext/>
+        <w:pageBreakBefore/>
+        <w:widowControl/>
+        <w:spacing w:before="400" w:after="200"/>
+      </w:pPr>
+      <w:r>
+        <w:t>PUBLICATIONS</w:t>
+      </w:r>
+    </w:p>
+    <w:p>
+      <w:pPr>
+        <w:pStyle w:val="Heading2"/>
+        <w:keepNext/>
+        <w:widowControl/>
+        <w:spacing w:before="280" w:after="200"/>
+      </w:pPr>
+      <w:r>
+        <w:t>Published or in Press</w:t>
+      </w:r>
+    </w:p>
+    <w:p>
+      <w:pPr>
         <w:keepNext/>
         <w:keepLines/>
         <w:widowControl/>
         <w:ind w:left="432" w:hanging="432"/>
       </w:pPr>
       <w:r>
-        <w:t>47. Genji Kawakita*, Ariel Zeleznikow-Johnston*, Ken Takeda*, Naotsugu Tsuchiya**, Masafumi Oizumi** (2025)</w:t>
+        <w:t>60. Tamami Nakano, Satoe Awada, Masafumi Oizumi, Daisuke Kuwano, Kazuyo Tanji, Nobumasa Kato, Noburo Saji (2026)</w:t>
       </w:r>
     </w:p>
     <w:p>
@@ -1030,7 +1011,7 @@
         <w:ind w:left="432"/>
       </w:pPr>
       <w:r>
-        <w:t>Is my "red" your "red"?: Evaluating structural correspondences between color similarity judgments using unsupervised alignment.</w:t>
+        <w:t>Atypical Tactile Expressions Using Japanese Ideophones in Adults With Autism Spectrum Disorders.</w:t>
       </w:r>
     </w:p>
     <w:p>
@@ -1041,7 +1022,7 @@
         <w:ind w:left="432"/>
       </w:pPr>
       <w:r>
-        <w:t xml:space="preserve">iScience, 28, 3, 112029. *, **: equal contribution </w:t>
+        <w:t xml:space="preserve">Journal of Autism and Developmental Disorders, advance online publication. </w:t>
       </w:r>
       <w:hyperlink r:id="rId24">
         <w:r>
@@ -1062,7 +1043,7 @@
         <w:ind w:left="432" w:hanging="432"/>
       </w:pPr>
       <w:r>
-        <w:t>46. Elise G. Rowe, Ken Takeda, Masafumi Oizumi, Joanita F. D'Souza, Jeroen J. A. van Boxtel, Naotsugu Tsuchiya (2025)</w:t>
+        <w:t>59. Ken Takeda, Masafumi Oizumi, Ryo Karakida (2026)</w:t>
       </w:r>
     </w:p>
     <w:p>
@@ -1073,7 +1054,7 @@
         <w:ind w:left="432"/>
       </w:pPr>
       <w:r>
-        <w:t>Qualia Structures Collapse for Geometric Shapes, but Not Faces, When Spatial Attention Is Withdrawn.</w:t>
+        <w:t>Continual Learning in Modern Hopfield Networks with an Application to Diffusion Models.</w:t>
       </w:r>
     </w:p>
     <w:p>
@@ -1084,7 +1065,7 @@
         <w:ind w:left="432"/>
       </w:pPr>
       <w:r>
-        <w:t xml:space="preserve">Neuroscience of Consciousness, 2025(1), niaf053. </w:t>
+        <w:t xml:space="preserve">Advances in Neural Information Processing Systems (NeurIPS), in press. </w:t>
       </w:r>
       <w:hyperlink r:id="rId25">
         <w:r>
@@ -1105,7 +1086,7 @@
         <w:ind w:left="432" w:hanging="432"/>
       </w:pPr>
       <w:r>
-        <w:t>45. Asaki Kataoka, Nipun Ravindu Wickramanayaka, Yu Togashi, Masafumi Oizumi (2025)</w:t>
+        <w:t>58. Soh Takahashi*, Masaru Sasaki*, Ken Takeda, Masafumi Oizumi (2026)</w:t>
       </w:r>
     </w:p>
     <w:p>
@@ -1116,7 +1097,7 @@
         <w:ind w:left="432"/>
       </w:pPr>
       <w:r>
-        <w:t>Spontaneous organization of diverse human color representations: from trichromacy to dichromacy in neural networks trained with retina-like inputs.</w:t>
+        <w:t>Investigating Fine- and Coarse-grained Structural Correspondences Between Deep Neural Networks and Human Object Image Similarity Judgments Using Unsupervised Alignment.</w:t>
       </w:r>
     </w:p>
     <w:p>
@@ -1127,7 +1108,7 @@
         <w:ind w:left="432"/>
       </w:pPr>
       <w:r>
-        <w:t xml:space="preserve">In International Conference on Machine Learning and Applications (ICMLA), 1137-1142. </w:t>
+        <w:t xml:space="preserve">Neural Networks, 195, 108222. *: equal contribution. </w:t>
       </w:r>
       <w:hyperlink r:id="rId26">
         <w:r>
@@ -1148,7 +1129,7 @@
         <w:ind w:left="432" w:hanging="432"/>
       </w:pPr>
       <w:r>
-        <w:t>44. Ken Takeda*, Masaru Sasaki*, Kota Abe, Masafumi Oizumi (2025)</w:t>
+        <w:t>57. Daiki Sekizawa, Sosuke Ito, Masafumi Oizumi (2026)</w:t>
       </w:r>
     </w:p>
     <w:p>
@@ -1159,7 +1140,7 @@
         <w:ind w:left="432"/>
       </w:pPr>
       <w:r>
-        <w:t>Unsupervised Alignment in Neuroscience: Introducing a Toolbox for Gromov-Wasserstein Optimal Transport.</w:t>
+        <w:t>Koopman Mode Decomposition of Thermodynamic Dissipation in Nonlinear Langevin Dynamics.</w:t>
       </w:r>
     </w:p>
     <w:p>
@@ -1170,7 +1151,50 @@
         <w:ind w:left="432"/>
       </w:pPr>
       <w:r>
-        <w:t xml:space="preserve">Journal of Neuroscience Methods, 419, 110443. *: equal contribution. The Toolbox is available on </w:t>
+        <w:t xml:space="preserve">Proceedings of the National Academy of Sciences, 123(25), e2530617123. </w:t>
+      </w:r>
+      <w:hyperlink r:id="rId11">
+        <w:r>
+          <w:rPr>
+            <w:color w:val="1155CC"/>
+            <w:u w:val="single"/>
+          </w:rPr>
+          <w:t>DOI</w:t>
+        </w:r>
+      </w:hyperlink>
+      <w:r/>
+    </w:p>
+    <w:p>
+      <w:pPr>
+        <w:keepNext/>
+        <w:keepLines/>
+        <w:widowControl/>
+        <w:ind w:left="432" w:hanging="432"/>
+      </w:pPr>
+      <w:r>
+        <w:t>56. Ikumi Oomoto, Daiki Kiyooka, Masafumi Oizumi, Masanori Murayama (2026)</w:t>
+      </w:r>
+    </w:p>
+    <w:p>
+      <w:pPr>
+        <w:keepNext/>
+        <w:keepLines/>
+        <w:widowControl/>
+        <w:ind w:left="432"/>
+      </w:pPr>
+      <w:r>
+        <w:t>Multi-area single-cell calcium imaging dataset of the mouse cortex across wakefulness, sleep, and anesthesia.</w:t>
+      </w:r>
+    </w:p>
+    <w:p>
+      <w:pPr>
+        <w:keepLines/>
+        <w:widowControl/>
+        <w:spacing w:after="240"/>
+        <w:ind w:left="432"/>
+      </w:pPr>
+      <w:r>
+        <w:t xml:space="preserve">Scientific Data, advance online publication. </w:t>
       </w:r>
       <w:hyperlink r:id="rId27">
         <w:r>
@@ -1178,11 +1202,85 @@
             <w:color w:val="1155CC"/>
             <w:u w:val="single"/>
           </w:rPr>
-          <w:t>GitHub</w:t>
+          <w:t>DOI</w:t>
         </w:r>
       </w:hyperlink>
-      <w:r>
-        <w:t xml:space="preserve"> </w:t>
+      <w:r/>
+    </w:p>
+    <w:p>
+      <w:pPr>
+        <w:keepNext/>
+        <w:keepLines/>
+        <w:widowControl/>
+        <w:ind w:left="432" w:hanging="432"/>
+      </w:pPr>
+      <w:r>
+        <w:t>55. Masafumi Oizumi, Chanseok Lim, Ryota Kanai (2026)</w:t>
+      </w:r>
+    </w:p>
+    <w:p>
+      <w:pPr>
+        <w:keepNext/>
+        <w:keepLines/>
+        <w:widowControl/>
+        <w:ind w:left="432"/>
+      </w:pPr>
+      <w:r>
+        <w:t>Principal bundle geometry of qualia: Understanding the quality of consciousness from symmetry.</w:t>
+      </w:r>
+    </w:p>
+    <w:p>
+      <w:pPr>
+        <w:keepLines/>
+        <w:widowControl/>
+        <w:spacing w:after="240"/>
+        <w:ind w:left="432"/>
+      </w:pPr>
+      <w:r>
+        <w:t xml:space="preserve">PNAS Nexus, 5(9), pgag261. </w:t>
+      </w:r>
+      <w:hyperlink r:id="rId12">
+        <w:r>
+          <w:rPr>
+            <w:color w:val="1155CC"/>
+            <w:u w:val="single"/>
+          </w:rPr>
+          <w:t>DOI</w:t>
+        </w:r>
+      </w:hyperlink>
+      <w:r/>
+    </w:p>
+    <w:p>
+      <w:pPr>
+        <w:keepNext/>
+        <w:keepLines/>
+        <w:widowControl/>
+        <w:ind w:left="432" w:hanging="432"/>
+      </w:pPr>
+      <w:r>
+        <w:t>54. Yumi Shikauchi, Mitsuaki Takemi, Leo Tomasevic, Jun Kitazono, Hartwig R. Siebner, and Masafumi Oizumi (2026)</w:t>
+      </w:r>
+    </w:p>
+    <w:p>
+      <w:pPr>
+        <w:keepNext/>
+        <w:keepLines/>
+        <w:widowControl/>
+        <w:ind w:left="432"/>
+      </w:pPr>
+      <w:r>
+        <w:t>Quantifying state-dependent control properties of brain dynamics from perturbation responses.</w:t>
+      </w:r>
+    </w:p>
+    <w:p>
+      <w:pPr>
+        <w:keepLines/>
+        <w:widowControl/>
+        <w:spacing w:after="240"/>
+        <w:ind w:left="432"/>
+      </w:pPr>
+      <w:r>
+        <w:t xml:space="preserve">The Journal of Neuroscience, 46(5), e0364252025. </w:t>
       </w:r>
       <w:hyperlink r:id="rId28">
         <w:r>
@@ -1203,7 +1301,7 @@
         <w:ind w:left="432" w:hanging="432"/>
       </w:pPr>
       <w:r>
-        <w:t>43. Ken Takeda*, Kota Abe*, Jun Kitazono and Masafumi Oizumi (2025)</w:t>
+        <w:t>53. Daiki Kiyooka*, Ikumi Oomoto*, Jun Kitazono, Yoshihito Saito, Midori Kobayashi, Chie Matsubara, Kenta Kobayashi, Masanori Murayama**, Masafumi Oizumi** (2026)</w:t>
       </w:r>
     </w:p>
     <w:p>
@@ -1214,7 +1312,7 @@
         <w:ind w:left="432"/>
       </w:pPr>
       <w:r>
-        <w:t>Unsupervised alignment reveals structural commonalities and differences in neural representations of natural scenes across individuals and brain areas.</w:t>
+        <w:t>Single-cell resolution functional networks during unconsciousness are segregated into spatially intermixed modules.</w:t>
       </w:r>
     </w:p>
     <w:p>
@@ -1225,7 +1323,50 @@
         <w:ind w:left="432"/>
       </w:pPr>
       <w:r>
-        <w:t xml:space="preserve">iScience, 28(5), 112427. *: equal contribution. </w:t>
+        <w:t xml:space="preserve">Cell Reports, 45(2), 116902. *, **: equal contribution </w:t>
+      </w:r>
+      <w:hyperlink r:id="rId13">
+        <w:r>
+          <w:rPr>
+            <w:color w:val="1155CC"/>
+            <w:u w:val="single"/>
+          </w:rPr>
+          <w:t>DOI</w:t>
+        </w:r>
+      </w:hyperlink>
+      <w:r/>
+    </w:p>
+    <w:p>
+      <w:pPr>
+        <w:keepNext/>
+        <w:keepLines/>
+        <w:widowControl/>
+        <w:ind w:left="432" w:hanging="432"/>
+      </w:pPr>
+      <w:r>
+        <w:t>52. Tomoya Taguchi, Jun Kitazono, Shuntaro Sasai, Masafumi Oizumi (2025)</w:t>
+      </w:r>
+    </w:p>
+    <w:p>
+      <w:pPr>
+        <w:keepNext/>
+        <w:keepLines/>
+        <w:widowControl/>
+        <w:ind w:left="432"/>
+      </w:pPr>
+      <w:r>
+        <w:t>Association of bidirectional network cores in the brain with perceptual awareness and cognition.</w:t>
+      </w:r>
+    </w:p>
+    <w:p>
+      <w:pPr>
+        <w:keepLines/>
+        <w:widowControl/>
+        <w:spacing w:after="240"/>
+        <w:ind w:left="432"/>
+      </w:pPr>
+      <w:r>
+        <w:t xml:space="preserve">The Journal of Neuroscience, 45(17), e0802242025. </w:t>
       </w:r>
       <w:hyperlink r:id="rId29">
         <w:r>
@@ -1246,7 +1387,7 @@
         <w:ind w:left="432" w:hanging="432"/>
       </w:pPr>
       <w:r>
-        <w:t>42. Shunsuke Kamiya, Taiga Mitamura, Muneki Ikeda, Masafumi Oizumi (2025)</w:t>
+        <w:t>51. Tononi G, Albantakis L, Barbosa L, Boly M, Cirelli C, Comolatti R, Ellia F, Findlay G, Girardi Casali A, Grasso M, Haun AM, Hendren J, Hoel E, Koch C, Maier A, Marshall W, Massimini M, Mayner WGP, Oizumi M, Szczotka J, Tsuchiya N, Zaeemzadeh A (2025)</w:t>
       </w:r>
     </w:p>
     <w:p>
@@ -1257,7 +1398,7 @@
         <w:ind w:left="432"/>
       </w:pPr>
       <w:r>
-        <w:t>Unsupervised Neuronal Matching with Spontaneous Neuronal Activity.</w:t>
+        <w:t>Consciousness or pseudo-consciousness? A clash of two paradigms.</w:t>
       </w:r>
     </w:p>
     <w:p>
@@ -1268,7 +1409,7 @@
         <w:ind w:left="432"/>
       </w:pPr>
       <w:r>
-        <w:t xml:space="preserve">In ICLR 2025 Workshop on Representational Alignment. </w:t>
+        <w:t xml:space="preserve">Nature Neuroscience, 28, 694–702. </w:t>
       </w:r>
       <w:hyperlink r:id="rId30">
         <w:r>
@@ -1289,7 +1430,7 @@
         <w:ind w:left="432" w:hanging="432"/>
       </w:pPr>
       <w:r>
-        <w:t>41. Daiki Sekizawa, Sosuke Ito, Masafumi Oizumi (2024)</w:t>
+        <w:t>50. Tadahiro Taniguchi, Masafumi Oizumi, Noburo Saji, Takato Horii, and Naotsugu Tsuchiya (2025)</w:t>
       </w:r>
     </w:p>
     <w:p>
@@ -1300,7 +1441,7 @@
         <w:ind w:left="432"/>
       </w:pPr>
       <w:r>
-        <w:t>Decomposing thermodynamic dissipation of linear Langevin systems via oscillatory modes and its application to neural dynamics.</w:t>
+        <w:t>Constructive approach to bidirectional influence between qualia structure and language emergence.</w:t>
       </w:r>
     </w:p>
     <w:p>
@@ -1311,7 +1452,7 @@
         <w:ind w:left="432"/>
       </w:pPr>
       <w:r>
-        <w:t xml:space="preserve">Physical Review X 14 (4), 041003. </w:t>
+        <w:t xml:space="preserve">Philosophy and the Mind Sciences, 6. </w:t>
       </w:r>
       <w:hyperlink r:id="rId31">
         <w:r>
@@ -1332,7 +1473,7 @@
         <w:ind w:left="432" w:hanging="432"/>
       </w:pPr>
       <w:r>
-        <w:t>40. Genji Kawakita, Ariel Zeleznikow-Johnston, Naotsugu Tsuchiya, Masafumi Oizumi (2024)</w:t>
+        <w:t>49. Haruka Asanuma, Naoko Koide-Majima, Ken Nakamura, Takato Horii, Shinji Nishimoto, Masafumi Oizumi (2025)</w:t>
       </w:r>
     </w:p>
     <w:p>
@@ -1343,7 +1484,7 @@
         <w:ind w:left="432"/>
       </w:pPr>
       <w:r>
-        <w:t>Gromov–Wasserstein unsupervised alignment reveals structural correspondences between the color similarity structures of humans and large language models.</w:t>
+        <w:t>Correspondence of high dimensional emotion structures elicited from video clips between humans and multimodal LLMs.</w:t>
       </w:r>
     </w:p>
     <w:p>
@@ -1354,7 +1495,7 @@
         <w:ind w:left="432"/>
       </w:pPr>
       <w:r>
-        <w:t xml:space="preserve">Scientific Reports 14 (1), 15917. </w:t>
+        <w:t xml:space="preserve">Scientific Reports, 15, 32175. </w:t>
       </w:r>
       <w:hyperlink r:id="rId32">
         <w:r>
@@ -1375,7 +1516,7 @@
         <w:ind w:left="432" w:hanging="432"/>
       </w:pPr>
       <w:r>
-        <w:t>39. Shunsuke Kamiya, Jun Kitazono, Masafumi Oizumi (2024)</w:t>
+        <w:t>48. Asaki Kataoka, Yoshihiro Nagano, and Masafumi Oizumi (2025)</w:t>
       </w:r>
     </w:p>
     <w:p>
@@ -1386,7 +1527,7 @@
         <w:ind w:left="432"/>
       </w:pPr>
       <w:r>
-        <w:t>Koopman Operator Based Dynamical Similarity Analysis for Data-driven Quantification of Distance between Dynamics.</w:t>
+        <w:t>Exploring internal representations of self-supervised networks: few-shot learning abilities and comparison with human semantics and recognition of objects.</w:t>
       </w:r>
     </w:p>
     <w:p>
@@ -1397,7 +1538,7 @@
         <w:ind w:left="432"/>
       </w:pPr>
       <w:r>
-        <w:t xml:space="preserve">In ICLR 2024 Workshop on Representational Alignment. </w:t>
+        <w:t xml:space="preserve">Frontiers in Computational Neuroscience, 19, 1613291. </w:t>
       </w:r>
       <w:hyperlink r:id="rId33">
         <w:r>
@@ -1418,7 +1559,7 @@
         <w:ind w:left="432" w:hanging="432"/>
       </w:pPr>
       <w:r>
-        <w:t>38. Soh Takahashi, Masaru Sasaki, Ken Takeda, Masafumi Oizumi (2024)</w:t>
+        <w:t>47. Genji Kawakita*, Ariel Zeleznikow-Johnston*, Ken Takeda*, Naotsugu Tsuchiya**, Masafumi Oizumi** (2025)</w:t>
       </w:r>
     </w:p>
     <w:p>
@@ -1429,7 +1570,7 @@
         <w:ind w:left="432"/>
       </w:pPr>
       <w:r>
-        <w:t>Self-supervised learning facilitates neural representation structures that can be unsupervisedly aligned to human behaviors.</w:t>
+        <w:t>Is my "red" your "red"?: Evaluating structural correspondences between color similarity judgments using unsupervised alignment.</w:t>
       </w:r>
     </w:p>
     <w:p>
@@ -1440,7 +1581,50 @@
         <w:ind w:left="432"/>
       </w:pPr>
       <w:r>
-        <w:t xml:space="preserve">In ICLR 2024 Workshop on Representational Alignment. </w:t>
+        <w:t xml:space="preserve">iScience, 28, 3, 112029. *, **: equal contribution </w:t>
+      </w:r>
+      <w:hyperlink r:id="rId14">
+        <w:r>
+          <w:rPr>
+            <w:color w:val="1155CC"/>
+            <w:u w:val="single"/>
+          </w:rPr>
+          <w:t>DOI</w:t>
+        </w:r>
+      </w:hyperlink>
+      <w:r/>
+    </w:p>
+    <w:p>
+      <w:pPr>
+        <w:keepNext/>
+        <w:keepLines/>
+        <w:widowControl/>
+        <w:ind w:left="432" w:hanging="432"/>
+      </w:pPr>
+      <w:r>
+        <w:t>46. Elise G. Rowe, Ken Takeda, Masafumi Oizumi, Joanita F. D'Souza, Jeroen J. A. van Boxtel, Naotsugu Tsuchiya (2025)</w:t>
+      </w:r>
+    </w:p>
+    <w:p>
+      <w:pPr>
+        <w:keepNext/>
+        <w:keepLines/>
+        <w:widowControl/>
+        <w:ind w:left="432"/>
+      </w:pPr>
+      <w:r>
+        <w:t>Qualia Structures Collapse for Geometric Shapes, but Not Faces, When Spatial Attention Is Withdrawn.</w:t>
+      </w:r>
+    </w:p>
+    <w:p>
+      <w:pPr>
+        <w:keepLines/>
+        <w:widowControl/>
+        <w:spacing w:after="240"/>
+        <w:ind w:left="432"/>
+      </w:pPr>
+      <w:r>
+        <w:t xml:space="preserve">Neuroscience of Consciousness, 2025(1), niaf053. </w:t>
       </w:r>
       <w:hyperlink r:id="rId34">
         <w:r>
@@ -1461,7 +1645,7 @@
         <w:ind w:left="432" w:hanging="432"/>
       </w:pPr>
       <w:r>
-        <w:t>37. Jun Kitazono, Yuma Aoki, Masafumi Oizumi (2023)</w:t>
+        <w:t>45. Asaki Kataoka, Nipun Ravindu Wickramanayaka, Yu Togashi, Masafumi Oizumi (2025)</w:t>
       </w:r>
     </w:p>
     <w:p>
@@ -1472,7 +1656,7 @@
         <w:ind w:left="432"/>
       </w:pPr>
       <w:r>
-        <w:t>Bidirectionally connected cores in a mouse connectome: Towards extracting the brain subnetworks essential for consciousness.</w:t>
+        <w:t>Spontaneous organization of diverse human color representations: from trichromacy to dichromacy in neural networks trained with retina-like inputs.</w:t>
       </w:r>
     </w:p>
     <w:p>
@@ -1483,7 +1667,7 @@
         <w:ind w:left="432"/>
       </w:pPr>
       <w:r>
-        <w:t xml:space="preserve">Cerebral Cortex, 33(4), 1383-1402. </w:t>
+        <w:t xml:space="preserve">In International Conference on Machine Learning and Applications (ICMLA), 1137-1142. </w:t>
       </w:r>
       <w:hyperlink r:id="rId35">
         <w:r>
@@ -1504,7 +1688,7 @@
         <w:ind w:left="432" w:hanging="432"/>
       </w:pPr>
       <w:r>
-        <w:t>36. Shunsuke Kamiya, Genji Kawakita, Shuntaro Sasai, Jun Kitazono, Masafumi Oizumi (2023)</w:t>
+        <w:t>44. Ken Takeda*, Masaru Sasaki*, Kota Abe, Masafumi Oizumi (2025)</w:t>
       </w:r>
     </w:p>
     <w:p>
@@ -1515,7 +1699,7 @@
         <w:ind w:left="432"/>
       </w:pPr>
       <w:r>
-        <w:t>Optimal Control Costs of Brain State Transitions in Linear Stochastic Systems.</w:t>
+        <w:t>Unsupervised Alignment in Neuroscience: Introducing a Toolbox for Gromov-Wasserstein Optimal Transport.</w:t>
       </w:r>
     </w:p>
     <w:p>
@@ -1526,7 +1710,62 @@
         <w:ind w:left="432"/>
       </w:pPr>
       <w:r>
-        <w:t xml:space="preserve">The Journal of Neuroscience, 43 (2), 270-281. </w:t>
+        <w:t xml:space="preserve">Journal of Neuroscience Methods, 419, 110443. *: equal contribution. The Toolbox is available on </w:t>
+      </w:r>
+      <w:hyperlink r:id="rId15">
+        <w:r>
+          <w:rPr>
+            <w:color w:val="1155CC"/>
+            <w:u w:val="single"/>
+          </w:rPr>
+          <w:t>GitHub</w:t>
+        </w:r>
+      </w:hyperlink>
+      <w:r>
+        <w:t xml:space="preserve"> </w:t>
+      </w:r>
+      <w:hyperlink r:id="rId16">
+        <w:r>
+          <w:rPr>
+            <w:color w:val="1155CC"/>
+            <w:u w:val="single"/>
+          </w:rPr>
+          <w:t>DOI</w:t>
+        </w:r>
+      </w:hyperlink>
+      <w:r/>
+    </w:p>
+    <w:p>
+      <w:pPr>
+        <w:keepNext/>
+        <w:keepLines/>
+        <w:widowControl/>
+        <w:ind w:left="432" w:hanging="432"/>
+      </w:pPr>
+      <w:r>
+        <w:t>43. Ken Takeda*, Kota Abe*, Jun Kitazono and Masafumi Oizumi (2025)</w:t>
+      </w:r>
+    </w:p>
+    <w:p>
+      <w:pPr>
+        <w:keepNext/>
+        <w:keepLines/>
+        <w:widowControl/>
+        <w:ind w:left="432"/>
+      </w:pPr>
+      <w:r>
+        <w:t>Unsupervised alignment reveals structural commonalities and differences in neural representations of natural scenes across individuals and brain areas.</w:t>
+      </w:r>
+    </w:p>
+    <w:p>
+      <w:pPr>
+        <w:keepLines/>
+        <w:widowControl/>
+        <w:spacing w:after="240"/>
+        <w:ind w:left="432"/>
+      </w:pPr>
+      <w:r>
+        <w:t xml:space="preserve">iScience, 28(5), 112427. *: equal contribution. </w:t>
       </w:r>
       <w:hyperlink r:id="rId36">
         <w:r>
@@ -1547,7 +1786,7 @@
         <w:ind w:left="432" w:hanging="432"/>
       </w:pPr>
       <w:r>
-        <w:t>35. Genji Kawakita, Shunsuke Kamiya, Shuntaro Sasai, Jun Kitazono, Masafumi Oizumi (2022)</w:t>
+        <w:t>42. Shunsuke Kamiya, Taiga Mitamura, Muneki Ikeda, Masafumi Oizumi (2025)</w:t>
       </w:r>
     </w:p>
     <w:p>
@@ -1558,7 +1797,7 @@
         <w:ind w:left="432"/>
       </w:pPr>
       <w:r>
-        <w:t>Quantifying brain state transition cost via Schrödinger's bridge.</w:t>
+        <w:t>Unsupervised Neuronal Matching with Spontaneous Neuronal Activity.</w:t>
       </w:r>
     </w:p>
     <w:p>
@@ -1569,7 +1808,7 @@
         <w:ind w:left="432"/>
       </w:pPr>
       <w:r>
-        <w:t xml:space="preserve">Network Neuroscience, 6 (1), 118–134. </w:t>
+        <w:t xml:space="preserve">In ICLR 2025 Workshop on Representational Alignment. </w:t>
       </w:r>
       <w:hyperlink r:id="rId37">
         <w:r>
@@ -1590,7 +1829,7 @@
         <w:ind w:left="432" w:hanging="432"/>
       </w:pPr>
       <w:r>
-        <w:t>34. Keisuke Ota, Yasuhiro Oisi, Takayuki Suzuki, Muneki Ikeda, Yoshiki Ito, Tsubasa Ito, Hiroyuki Uwamori, Kenta Kobayashi, Midori Kobayashi, Maya Odagawa, Chie Matsubara, Yoshinori Kuroiwa, Masaru Horikoshi, Junya Matsushita, Hiroyuki Hioki, Masamichi Ohkura, Junichi Nakai, Masafumi Oizumi, Atsushi Miyawaki, Toru Aonishi, Takahiro Ode, Masanori Murayama (2021)</w:t>
+        <w:t>41. Daiki Sekizawa, Sosuke Ito, Masafumi Oizumi (2024)</w:t>
       </w:r>
     </w:p>
     <w:p>
@@ -1601,7 +1840,7 @@
         <w:ind w:left="432"/>
       </w:pPr>
       <w:r>
-        <w:t>Fast, cell-resolution, contiguous-wide two-photon imaging to reveal functional network architectures across multi-modal cortical areas.</w:t>
+        <w:t>Decomposing thermodynamic dissipation of linear Langevin systems via oscillatory modes and its application to neural dynamics.</w:t>
       </w:r>
     </w:p>
     <w:p>
@@ -1612,7 +1851,50 @@
         <w:ind w:left="432"/>
       </w:pPr>
       <w:r>
-        <w:t xml:space="preserve">Neuron, 109(11), 1810-1824.e9. </w:t>
+        <w:t xml:space="preserve">Physical Review X 14 (4), 041003. </w:t>
+      </w:r>
+      <w:hyperlink r:id="rId17">
+        <w:r>
+          <w:rPr>
+            <w:color w:val="1155CC"/>
+            <w:u w:val="single"/>
+          </w:rPr>
+          <w:t>DOI</w:t>
+        </w:r>
+      </w:hyperlink>
+      <w:r/>
+    </w:p>
+    <w:p>
+      <w:pPr>
+        <w:keepNext/>
+        <w:keepLines/>
+        <w:widowControl/>
+        <w:ind w:left="432" w:hanging="432"/>
+      </w:pPr>
+      <w:r>
+        <w:t>40. Genji Kawakita, Ariel Zeleznikow-Johnston, Naotsugu Tsuchiya, Masafumi Oizumi (2024)</w:t>
+      </w:r>
+    </w:p>
+    <w:p>
+      <w:pPr>
+        <w:keepNext/>
+        <w:keepLines/>
+        <w:widowControl/>
+        <w:ind w:left="432"/>
+      </w:pPr>
+      <w:r>
+        <w:t>Gromov–Wasserstein unsupervised alignment reveals structural correspondences between the color similarity structures of humans and large language models.</w:t>
+      </w:r>
+    </w:p>
+    <w:p>
+      <w:pPr>
+        <w:keepLines/>
+        <w:widowControl/>
+        <w:spacing w:after="240"/>
+        <w:ind w:left="432"/>
+      </w:pPr>
+      <w:r>
+        <w:t xml:space="preserve">Scientific Reports 14 (1), 15917. </w:t>
       </w:r>
       <w:hyperlink r:id="rId38">
         <w:r>
@@ -1633,7 +1915,7 @@
         <w:ind w:left="432" w:hanging="432"/>
       </w:pPr>
       <w:r>
-        <w:t>33. Kotaro Ishizu, Tomoyo I. Shiramatsu, Rie Hitsuyu, Masafumi Oizumi, Naotsugu Tsuchiya, Hirokazu Takahashi (2021)</w:t>
+        <w:t>39. Shunsuke Kamiya, Jun Kitazono, Masafumi Oizumi (2024)</w:t>
       </w:r>
     </w:p>
     <w:p>
@@ -1644,7 +1926,7 @@
         <w:ind w:left="432"/>
       </w:pPr>
       <w:r>
-        <w:t>Information flow in the rat thalamo-cortical system: spontaneous vs. stimulus-evoked activities.</w:t>
+        <w:t>Koopman Operator Based Dynamical Similarity Analysis for Data-driven Quantification of Distance between Dynamics.</w:t>
       </w:r>
     </w:p>
     <w:p>
@@ -1655,7 +1937,7 @@
         <w:ind w:left="432"/>
       </w:pPr>
       <w:r>
-        <w:t xml:space="preserve">Scientific Reports, 11(19252). </w:t>
+        <w:t xml:space="preserve">In ICLR 2024 Workshop on Representational Alignment. </w:t>
       </w:r>
       <w:hyperlink r:id="rId39">
         <w:r>
@@ -1676,7 +1958,7 @@
         <w:ind w:left="432" w:hanging="432"/>
       </w:pPr>
       <w:r>
-        <w:t>32. Dror Cohen, Shuntaro Sasai, Naotsugu Tsuchiya, Masafumi Oizumi (2020)</w:t>
+        <w:t>38. Soh Takahashi, Masaru Sasaki, Ken Takeda, Masafumi Oizumi (2024)</w:t>
       </w:r>
     </w:p>
     <w:p>
@@ -1687,7 +1969,7 @@
         <w:ind w:left="432"/>
       </w:pPr>
       <w:r>
-        <w:t>A general spectral decomposition of causal influences applied to integrated information.</w:t>
+        <w:t>Self-supervised learning facilitates neural representation structures that can be unsupervisedly aligned to human behaviors.</w:t>
       </w:r>
     </w:p>
     <w:p>
@@ -1698,7 +1980,7 @@
         <w:ind w:left="432"/>
       </w:pPr>
       <w:r>
-        <w:t xml:space="preserve">The Journal of Neuroscience Methods, 330, 108443. </w:t>
+        <w:t xml:space="preserve">In ICLR 2024 Workshop on Representational Alignment. </w:t>
       </w:r>
       <w:hyperlink r:id="rId40">
         <w:r>
@@ -1719,7 +2001,7 @@
         <w:ind w:left="432" w:hanging="432"/>
       </w:pPr>
       <w:r>
-        <w:t>31. Akihiro Eguchi, Takato Horii, Takayuki Nagai, Ryota Kanai, Masafumi Oizumi (2020)</w:t>
+        <w:t>37. Jun Kitazono, Yuma Aoki, Masafumi Oizumi (2023)</w:t>
       </w:r>
     </w:p>
     <w:p>
@@ -1730,7 +2012,7 @@
         <w:ind w:left="432"/>
       </w:pPr>
       <w:r>
-        <w:t>An Information Theoretic Approach to Reveal the Formation of Shared Representations.</w:t>
+        <w:t>Bidirectionally connected cores in a mouse connectome: Towards extracting the brain subnetworks essential for consciousness.</w:t>
       </w:r>
     </w:p>
     <w:p>
@@ -1741,7 +2023,93 @@
         <w:ind w:left="432"/>
       </w:pPr>
       <w:r>
-        <w:t xml:space="preserve">Frontiers in Computational Neuroscience. </w:t>
+        <w:t xml:space="preserve">Cerebral Cortex, 33(4), 1383-1402. </w:t>
+      </w:r>
+      <w:hyperlink r:id="rId18">
+        <w:r>
+          <w:rPr>
+            <w:color w:val="1155CC"/>
+            <w:u w:val="single"/>
+          </w:rPr>
+          <w:t>DOI</w:t>
+        </w:r>
+      </w:hyperlink>
+      <w:r/>
+    </w:p>
+    <w:p>
+      <w:pPr>
+        <w:keepNext/>
+        <w:keepLines/>
+        <w:widowControl/>
+        <w:ind w:left="432" w:hanging="432"/>
+      </w:pPr>
+      <w:r>
+        <w:t>36. Shunsuke Kamiya, Genji Kawakita, Shuntaro Sasai, Jun Kitazono, Masafumi Oizumi (2023)</w:t>
+      </w:r>
+    </w:p>
+    <w:p>
+      <w:pPr>
+        <w:keepNext/>
+        <w:keepLines/>
+        <w:widowControl/>
+        <w:ind w:left="432"/>
+      </w:pPr>
+      <w:r>
+        <w:t>Optimal Control Costs of Brain State Transitions in Linear Stochastic Systems.</w:t>
+      </w:r>
+    </w:p>
+    <w:p>
+      <w:pPr>
+        <w:keepLines/>
+        <w:widowControl/>
+        <w:spacing w:after="240"/>
+        <w:ind w:left="432"/>
+      </w:pPr>
+      <w:r>
+        <w:t xml:space="preserve">The Journal of Neuroscience, 43 (2), 270-281. </w:t>
+      </w:r>
+      <w:hyperlink r:id="rId19">
+        <w:r>
+          <w:rPr>
+            <w:color w:val="1155CC"/>
+            <w:u w:val="single"/>
+          </w:rPr>
+          <w:t>DOI</w:t>
+        </w:r>
+      </w:hyperlink>
+      <w:r/>
+    </w:p>
+    <w:p>
+      <w:pPr>
+        <w:keepNext/>
+        <w:keepLines/>
+        <w:widowControl/>
+        <w:ind w:left="432" w:hanging="432"/>
+      </w:pPr>
+      <w:r>
+        <w:t>35. Genji Kawakita, Shunsuke Kamiya, Shuntaro Sasai, Jun Kitazono, Masafumi Oizumi (2022)</w:t>
+      </w:r>
+    </w:p>
+    <w:p>
+      <w:pPr>
+        <w:keepNext/>
+        <w:keepLines/>
+        <w:widowControl/>
+        <w:ind w:left="432"/>
+      </w:pPr>
+      <w:r>
+        <w:t>Quantifying brain state transition cost via Schrödinger's bridge.</w:t>
+      </w:r>
+    </w:p>
+    <w:p>
+      <w:pPr>
+        <w:keepLines/>
+        <w:widowControl/>
+        <w:spacing w:after="240"/>
+        <w:ind w:left="432"/>
+      </w:pPr>
+      <w:r>
+        <w:t xml:space="preserve">Network Neuroscience, 6 (1), 118–134. </w:t>
       </w:r>
       <w:hyperlink r:id="rId41">
         <w:r>
@@ -1762,7 +2130,7 @@
         <w:ind w:left="432" w:hanging="432"/>
       </w:pPr>
       <w:r>
-        <w:t>30. Jun Kitazono, Ryota Kanai, Masafumi Oizumi (2020)</w:t>
+        <w:t>34. Keisuke Ota, Yasuhiro Oisi, Takayuki Suzuki, Muneki Ikeda, Yoshiki Ito, Tsubasa Ito, Hiroyuki Uwamori, Kenta Kobayashi, Midori Kobayashi, Maya Odagawa, Chie Matsubara, Yoshinori Kuroiwa, Masaru Horikoshi, Junya Matsushita, Hiroyuki Hioki, Masamichi Ohkura, Junichi Nakai, Masafumi Oizumi, Atsushi Miyawaki, Toru Aonishi, Takahiro Ode, Masanori Murayama (2021)</w:t>
       </w:r>
     </w:p>
     <w:p>
@@ -1773,7 +2141,7 @@
         <w:ind w:left="432"/>
       </w:pPr>
       <w:r>
-        <w:t>Efficient search for informational cores in complex systems: Application to brain networks.</w:t>
+        <w:t>Fast, cell-resolution, contiguous-wide two-photon imaging to reveal functional network architectures across multi-modal cortical areas.</w:t>
       </w:r>
     </w:p>
     <w:p>
@@ -1784,7 +2152,7 @@
         <w:ind w:left="432"/>
       </w:pPr>
       <w:r>
-        <w:t xml:space="preserve">Neural Networks, 132, 232-244. </w:t>
+        <w:t xml:space="preserve">Neuron, 109(11), 1810-1824.e9. </w:t>
       </w:r>
       <w:hyperlink r:id="rId42">
         <w:r>
@@ -1805,7 +2173,7 @@
         <w:ind w:left="432" w:hanging="432"/>
       </w:pPr>
       <w:r>
-        <w:t>29. Sosuke Ito, Masafumi Oizumi, and Shun-ichi Amari (2020)</w:t>
+        <w:t>33. Kotaro Ishizu, Tomoyo I. Shiramatsu, Rie Hitsuyu, Masafumi Oizumi, Naotsugu Tsuchiya, Hirokazu Takahashi (2021)</w:t>
       </w:r>
     </w:p>
     <w:p>
@@ -1816,7 +2184,7 @@
         <w:ind w:left="432"/>
       </w:pPr>
       <w:r>
-        <w:t>Unified framework for the entropy production and the stochastic interaction based on information geometry.</w:t>
+        <w:t>Information flow in the rat thalamo-cortical system: spontaneous vs. stimulus-evoked activities.</w:t>
       </w:r>
     </w:p>
     <w:p>
@@ -1827,7 +2195,7 @@
         <w:ind w:left="432"/>
       </w:pPr>
       <w:r>
-        <w:t xml:space="preserve">Physical Review Research, 2, 033048. </w:t>
+        <w:t xml:space="preserve">Scientific Reports, 11(19252). </w:t>
       </w:r>
       <w:hyperlink r:id="rId43">
         <w:r>
@@ -1848,7 +2216,7 @@
         <w:ind w:left="432" w:hanging="432"/>
       </w:pPr>
       <w:r>
-        <w:t>28. Shun-ichi Amari, Ryo Karakida, Masafumi Oizumi (2019)</w:t>
+        <w:t>32. Dror Cohen, Shuntaro Sasai, Naotsugu Tsuchiya, Masafumi Oizumi (2020)</w:t>
       </w:r>
     </w:p>
     <w:p>
@@ -1859,7 +2227,7 @@
         <w:ind w:left="432"/>
       </w:pPr>
       <w:r>
-        <w:t>Fisher Information and Natural Gradient Learning in Random Deep Networks.</w:t>
+        <w:t>A general spectral decomposition of causal influences applied to integrated information.</w:t>
       </w:r>
     </w:p>
     <w:p>
@@ -1870,7 +2238,7 @@
         <w:ind w:left="432"/>
       </w:pPr>
       <w:r>
-        <w:t xml:space="preserve">Proceedings of Machine Learning Research, in PMLR 89:694-702. </w:t>
+        <w:t xml:space="preserve">The Journal of Neuroscience Methods, 330, 108443. </w:t>
       </w:r>
       <w:hyperlink r:id="rId44">
         <w:r>
@@ -1891,7 +2259,7 @@
         <w:ind w:left="432" w:hanging="432"/>
       </w:pPr>
       <w:r>
-        <w:t>27. Shun-ichi Amari, Ryo Karakida, Masafumi Oizumi, Marco Cuturi (2019)</w:t>
+        <w:t>31. Akihiro Eguchi, Takato Horii, Takayuki Nagai, Ryota Kanai, Masafumi Oizumi (2020)</w:t>
       </w:r>
     </w:p>
     <w:p>
@@ -1902,7 +2270,7 @@
         <w:ind w:left="432"/>
       </w:pPr>
       <w:r>
-        <w:t>Information Geometry for Regularized Optimal Transport and Barycenters of Patterns.</w:t>
+        <w:t>An Information Theoretic Approach to Reveal the Formation of Shared Representations.</w:t>
       </w:r>
     </w:p>
     <w:p>
@@ -1913,7 +2281,7 @@
         <w:ind w:left="432"/>
       </w:pPr>
       <w:r>
-        <w:t xml:space="preserve">Neural Computation, 31(5), 827-848. </w:t>
+        <w:t xml:space="preserve">Frontiers in Computational Neuroscience. </w:t>
       </w:r>
       <w:hyperlink r:id="rId45">
         <w:r>
@@ -1934,7 +2302,7 @@
         <w:ind w:left="432" w:hanging="432"/>
       </w:pPr>
       <w:r>
-        <w:t>26. Shun-ichi Amari, Ryo Karakida, Masafumi Oizumi (2019)</w:t>
+        <w:t>30. Jun Kitazono, Ryota Kanai, Masafumi Oizumi (2020)</w:t>
       </w:r>
     </w:p>
     <w:p>
@@ -1945,7 +2313,7 @@
         <w:ind w:left="432"/>
       </w:pPr>
       <w:r>
-        <w:t>Statistical Neurodynamics of Deep Networks: Geometry of Signal Spaces.</w:t>
+        <w:t>Efficient search for informational cores in complex systems: Application to brain networks.</w:t>
       </w:r>
     </w:p>
     <w:p>
@@ -1956,7 +2324,7 @@
         <w:ind w:left="432"/>
       </w:pPr>
       <w:r>
-        <w:t xml:space="preserve">Nonlinear Theory and Its Applications, IEICE, 10(4), 322-336. </w:t>
+        <w:t xml:space="preserve">Neural Networks, 132, 232-244. </w:t>
       </w:r>
       <w:hyperlink r:id="rId46">
         <w:r>
@@ -1977,7 +2345,7 @@
         <w:ind w:left="432" w:hanging="432"/>
       </w:pPr>
       <w:r>
-        <w:t>25. Jun Kitazono, Ryota Kanai, Masafumi Oizumi (2018)</w:t>
+        <w:t>29. Sosuke Ito, Masafumi Oizumi, and Shun-ichi Amari (2020)</w:t>
       </w:r>
     </w:p>
     <w:p>
@@ -1988,7 +2356,7 @@
         <w:ind w:left="432"/>
       </w:pPr>
       <w:r>
-        <w:t>Efficient Algorithms for Searching the Minimum Information Partition in Integrated Information Theory.</w:t>
+        <w:t>Unified framework for the entropy production and the stochastic interaction based on information geometry.</w:t>
       </w:r>
     </w:p>
     <w:p>
@@ -1999,7 +2367,7 @@
         <w:ind w:left="432"/>
       </w:pPr>
       <w:r>
-        <w:t xml:space="preserve">Entropy, 20(3), 173. </w:t>
+        <w:t xml:space="preserve">Physical Review Research, 2, 033048. </w:t>
       </w:r>
       <w:hyperlink r:id="rId47">
         <w:r>
@@ -2020,7 +2388,7 @@
         <w:ind w:left="432" w:hanging="432"/>
       </w:pPr>
       <w:r>
-        <w:t>24. Shohei Hidaka, Masafumi Oizumi (2018)</w:t>
+        <w:t>28. Shun-ichi Amari, Ryo Karakida, Masafumi Oizumi (2019)</w:t>
       </w:r>
     </w:p>
     <w:p>
@@ -2031,7 +2399,7 @@
         <w:ind w:left="432"/>
       </w:pPr>
       <w:r>
-        <w:t>Fast and exact search for the partition with minimal information loss.</w:t>
+        <w:t>Fisher Information and Natural Gradient Learning in Random Deep Networks.</w:t>
       </w:r>
     </w:p>
     <w:p>
@@ -2042,7 +2410,7 @@
         <w:ind w:left="432"/>
       </w:pPr>
       <w:r>
-        <w:t xml:space="preserve">PLoS ONE, 13(9), e0201126. </w:t>
+        <w:t xml:space="preserve">Proceedings of Machine Learning Research, in PMLR 89:694-702. </w:t>
       </w:r>
       <w:hyperlink r:id="rId48">
         <w:r>
@@ -2063,7 +2431,7 @@
         <w:ind w:left="432" w:hanging="432"/>
       </w:pPr>
       <w:r>
-        <w:t>23. Shun-ichi Amari, Ryo Karakida, Masafumi Oizumi (2018)</w:t>
+        <w:t>27. Shun-ichi Amari, Ryo Karakida, Masafumi Oizumi, Marco Cuturi (2019)</w:t>
       </w:r>
     </w:p>
     <w:p>
@@ -2074,7 +2442,7 @@
         <w:ind w:left="432"/>
       </w:pPr>
       <w:r>
-        <w:t>Information Geometry Connecting Wasserstein Distance and Kullback-Leibler Divergence via the Entropy-Relaxed Transportation Problem.</w:t>
+        <w:t>Information Geometry for Regularized Optimal Transport and Barycenters of Patterns.</w:t>
       </w:r>
     </w:p>
     <w:p>
@@ -2085,7 +2453,7 @@
         <w:ind w:left="432"/>
       </w:pPr>
       <w:r>
-        <w:t xml:space="preserve">Information Geometry, 1(1), 1-25. </w:t>
+        <w:t xml:space="preserve">Neural Computation, 31(5), 827-848. </w:t>
       </w:r>
       <w:hyperlink r:id="rId49">
         <w:r>
@@ -2106,7 +2474,7 @@
         <w:ind w:left="432" w:hanging="432"/>
       </w:pPr>
       <w:r>
-        <w:t>22. Hiroki Mori, Masafumi Oizumi (2018)</w:t>
+        <w:t>26. Shun-ichi Amari, Ryo Karakida, Masafumi Oizumi (2019)</w:t>
       </w:r>
     </w:p>
     <w:p>
@@ -2117,7 +2485,7 @@
         <w:ind w:left="432"/>
       </w:pPr>
       <w:r>
-        <w:t>Information integration in a globally coupled chaotic system.</w:t>
+        <w:t>Statistical Neurodynamics of Deep Networks: Geometry of Signal Spaces.</w:t>
       </w:r>
     </w:p>
     <w:p>
@@ -2128,7 +2496,7 @@
         <w:ind w:left="432"/>
       </w:pPr>
       <w:r>
-        <w:t xml:space="preserve">In The 2018 Conference on Artificial Life, 384-385. </w:t>
+        <w:t xml:space="preserve">Nonlinear Theory and Its Applications, IEICE, 10(4), 322-336. </w:t>
       </w:r>
       <w:hyperlink r:id="rId50">
         <w:r>
@@ -2149,7 +2517,7 @@
         <w:ind w:left="432" w:hanging="432"/>
       </w:pPr>
       <w:r>
-        <w:t>21. Andrew M. Haun, Masafumi Oizumi, Christopher K. Kovach, Hiroto Kawasaki, Hiroyuki Oya, Matthew A. Howard, Ralph Adolphs, Naotsugu Tsuchiya (2017)</w:t>
+        <w:t>25. Jun Kitazono, Ryota Kanai, Masafumi Oizumi (2018)</w:t>
       </w:r>
     </w:p>
     <w:p>
@@ -2160,7 +2528,7 @@
         <w:ind w:left="432"/>
       </w:pPr>
       <w:r>
-        <w:t>Conscious Perception as Integrated Information Patterns in Human Electrocorticography.</w:t>
+        <w:t>Efficient Algorithms for Searching the Minimum Information Partition in Integrated Information Theory.</w:t>
       </w:r>
     </w:p>
     <w:p>
@@ -2171,7 +2539,7 @@
         <w:ind w:left="432"/>
       </w:pPr>
       <w:r>
-        <w:t xml:space="preserve">eNeuro, 4(5), ENEURO.0085-17.2017. </w:t>
+        <w:t xml:space="preserve">Entropy, 20(3), 173. </w:t>
       </w:r>
       <w:hyperlink r:id="rId51">
         <w:r>
@@ -2192,7 +2560,7 @@
         <w:ind w:left="432" w:hanging="432"/>
       </w:pPr>
       <w:r>
-        <w:t>20. Naotsugu Tsuchiya, Andrew Haun, Dror Cohen, Masafumi Oizumi (2016)</w:t>
+        <w:t>24. Shohei Hidaka, Masafumi Oizumi (2018)</w:t>
       </w:r>
     </w:p>
     <w:p>
@@ -2203,7 +2571,7 @@
         <w:ind w:left="432"/>
       </w:pPr>
       <w:r>
-        <w:t>Empirical tests of the integrated information theory of consciousness.</w:t>
+        <w:t>Fast and exact search for the partition with minimal information loss.</w:t>
       </w:r>
     </w:p>
     <w:p>
@@ -2214,40 +2582,7 @@
         <w:ind w:left="432"/>
       </w:pPr>
       <w:r>
-        <w:t>In The Return of Consciousness: A New Science on Old Questions, 349-374.</w:t>
-      </w:r>
-    </w:p>
-    <w:p>
-      <w:pPr>
-        <w:keepNext/>
-        <w:keepLines/>
-        <w:widowControl/>
-        <w:ind w:left="432" w:hanging="432"/>
-      </w:pPr>
-      <w:r>
-        <w:t>19. Shun-ichi Amari, Naotsugu Tsuchiya, Masafumi Oizumi (2016)</w:t>
-      </w:r>
-    </w:p>
-    <w:p>
-      <w:pPr>
-        <w:keepNext/>
-        <w:keepLines/>
-        <w:widowControl/>
-        <w:ind w:left="432"/>
-      </w:pPr>
-      <w:r>
-        <w:t>Geometry of information integration.</w:t>
-      </w:r>
-    </w:p>
-    <w:p>
-      <w:pPr>
-        <w:keepLines/>
-        <w:widowControl/>
-        <w:spacing w:after="240"/>
-        <w:ind w:left="432"/>
-      </w:pPr>
-      <w:r>
-        <w:t xml:space="preserve">Information Geometry and its Applications IV (pp. 3-17). Springer, Cham. </w:t>
+        <w:t xml:space="preserve">PLoS ONE, 13(9), e0201126. </w:t>
       </w:r>
       <w:hyperlink r:id="rId52">
         <w:r>
@@ -2268,7 +2603,7 @@
         <w:ind w:left="432" w:hanging="432"/>
       </w:pPr>
       <w:r>
-        <w:t>18. Masafumi Oizumi, Shun-ichi Amari, Toru Yanagawa, Naotaka Fujii, Naotsugu Tsuchiya (2016)</w:t>
+        <w:t>23. Shun-ichi Amari, Ryo Karakida, Masafumi Oizumi (2018)</w:t>
       </w:r>
     </w:p>
     <w:p>
@@ -2279,7 +2614,7 @@
         <w:ind w:left="432"/>
       </w:pPr>
       <w:r>
-        <w:t>Measuring Integrated Information from the Decoding Perspective.</w:t>
+        <w:t>Information Geometry Connecting Wasserstein Distance and Kullback-Leibler Divergence via the Entropy-Relaxed Transportation Problem.</w:t>
       </w:r>
     </w:p>
     <w:p>
@@ -2290,7 +2625,7 @@
         <w:ind w:left="432"/>
       </w:pPr>
       <w:r>
-        <w:t xml:space="preserve">PLoS Comput Biol, 12(1), e1004654. </w:t>
+        <w:t xml:space="preserve">Information Geometry, 1(1), 1-25. </w:t>
       </w:r>
       <w:hyperlink r:id="rId53">
         <w:r>
@@ -2311,7 +2646,7 @@
         <w:ind w:left="432" w:hanging="432"/>
       </w:pPr>
       <w:r>
-        <w:t>17. Masafumi Oizumi, Naotsugu Tsuchiya, Shun-ichi Amari (2016)</w:t>
+        <w:t>22. Hiroki Mori, Masafumi Oizumi (2018)</w:t>
       </w:r>
     </w:p>
     <w:p>
@@ -2322,7 +2657,7 @@
         <w:ind w:left="432"/>
       </w:pPr>
       <w:r>
-        <w:t>Unified Framework for Information Integration Based on Information Geometry.</w:t>
+        <w:t>Information integration in a globally coupled chaotic system.</w:t>
       </w:r>
     </w:p>
     <w:p>
@@ -2333,7 +2668,7 @@
         <w:ind w:left="432"/>
       </w:pPr>
       <w:r>
-        <w:t xml:space="preserve">Proceedings of the National Academy of Sciences, 113(51), 14817-14822. </w:t>
+        <w:t xml:space="preserve">In The 2018 Conference on Artificial Life, 384-385. </w:t>
       </w:r>
       <w:hyperlink r:id="rId54">
         <w:r>
@@ -2354,7 +2689,7 @@
         <w:ind w:left="432" w:hanging="432"/>
       </w:pPr>
       <w:r>
-        <w:t>16. Melanie Boly, Shuntaro Sasai, Olivia Gosseries, Masafumi Oizumi, Adenauer Casali, Marcello Massimini, Giulio Tononi (2015)</w:t>
+        <w:t>21. Andrew M. Haun, Masafumi Oizumi, Christopher K. Kovach, Hiroto Kawasaki, Hiroyuki Oya, Matthew A. Howard, Ralph Adolphs, Naotsugu Tsuchiya (2017)</w:t>
       </w:r>
     </w:p>
     <w:p>
@@ -2365,7 +2700,7 @@
         <w:ind w:left="432"/>
       </w:pPr>
       <w:r>
-        <w:t>Stimulus Set Meaningfulness and Neurophysiological Differentiation: A Functional Magnetic Resonance Imaging Study.</w:t>
+        <w:t>Conscious Perception as Integrated Information Patterns in Human Electrocorticography.</w:t>
       </w:r>
     </w:p>
     <w:p>
@@ -2376,7 +2711,7 @@
         <w:ind w:left="432"/>
       </w:pPr>
       <w:r>
-        <w:t xml:space="preserve">PLoS ONE, 10(5): e0125337. </w:t>
+        <w:t xml:space="preserve">eNeuro, 4(5), ENEURO.0085-17.2017. </w:t>
       </w:r>
       <w:hyperlink r:id="rId55">
         <w:r>
@@ -2397,7 +2732,7 @@
         <w:ind w:left="432" w:hanging="432"/>
       </w:pPr>
       <w:r>
-        <w:t>15. Masafumi Oizumi*, Larissa Albantakis*, Giulio Tononi (2014)</w:t>
+        <w:t>20. Naotsugu Tsuchiya, Andrew Haun, Dror Cohen, Masafumi Oizumi (2016)</w:t>
       </w:r>
     </w:p>
     <w:p>
@@ -2408,7 +2743,7 @@
         <w:ind w:left="432"/>
       </w:pPr>
       <w:r>
-        <w:t>From the Phenomenology to the Mechanisms of Consciousness: Integrated Information Theory 3.0.</w:t>
+        <w:t>Empirical tests of the integrated information theory of consciousness.</w:t>
       </w:r>
     </w:p>
     <w:p>
@@ -2419,7 +2754,40 @@
         <w:ind w:left="432"/>
       </w:pPr>
       <w:r>
-        <w:t xml:space="preserve">PLoS Computational Biology, 10, e1003588. *: equal contribution </w:t>
+        <w:t>In The Return of Consciousness: A New Science on Old Questions, 349-374.</w:t>
+      </w:r>
+    </w:p>
+    <w:p>
+      <w:pPr>
+        <w:keepNext/>
+        <w:keepLines/>
+        <w:widowControl/>
+        <w:ind w:left="432" w:hanging="432"/>
+      </w:pPr>
+      <w:r>
+        <w:t>19. Shun-ichi Amari, Naotsugu Tsuchiya, Masafumi Oizumi (2016)</w:t>
+      </w:r>
+    </w:p>
+    <w:p>
+      <w:pPr>
+        <w:keepNext/>
+        <w:keepLines/>
+        <w:widowControl/>
+        <w:ind w:left="432"/>
+      </w:pPr>
+      <w:r>
+        <w:t>Geometry of information integration.</w:t>
+      </w:r>
+    </w:p>
+    <w:p>
+      <w:pPr>
+        <w:keepLines/>
+        <w:widowControl/>
+        <w:spacing w:after="240"/>
+        <w:ind w:left="432"/>
+      </w:pPr>
+      <w:r>
+        <w:t xml:space="preserve">Information Geometry and its Applications IV (pp. 3-17). Springer, Cham. </w:t>
       </w:r>
       <w:hyperlink r:id="rId56">
         <w:r>
@@ -2440,7 +2808,7 @@
         <w:ind w:left="432" w:hanging="432"/>
       </w:pPr>
       <w:r>
-        <w:t>14. Akinori Mitani, Ryo Sasaki, Masafumi Oizumi, Takanori Uka (2013)</w:t>
+        <w:t>18. Masafumi Oizumi, Shun-ichi Amari, Toru Yanagawa, Naotaka Fujii, Naotsugu Tsuchiya (2016)</w:t>
       </w:r>
     </w:p>
     <w:p>
@@ -2451,7 +2819,7 @@
         <w:ind w:left="432"/>
       </w:pPr>
       <w:r>
-        <w:t>A leaky-integrator model as a control mechanism underlying flexible decision making during task switching.</w:t>
+        <w:t>Measuring Integrated Information from the Decoding Perspective.</w:t>
       </w:r>
     </w:p>
     <w:p>
@@ -2462,7 +2830,93 @@
         <w:ind w:left="432"/>
       </w:pPr>
       <w:r>
-        <w:t xml:space="preserve">PLoS ONE, 8, e59670. </w:t>
+        <w:t xml:space="preserve">PLoS Comput Biol, 12(1), e1004654. </w:t>
+      </w:r>
+      <w:hyperlink r:id="rId20">
+        <w:r>
+          <w:rPr>
+            <w:color w:val="1155CC"/>
+            <w:u w:val="single"/>
+          </w:rPr>
+          <w:t>DOI</w:t>
+        </w:r>
+      </w:hyperlink>
+      <w:r/>
+    </w:p>
+    <w:p>
+      <w:pPr>
+        <w:keepNext/>
+        <w:keepLines/>
+        <w:widowControl/>
+        <w:ind w:left="432" w:hanging="432"/>
+      </w:pPr>
+      <w:r>
+        <w:t>17. Masafumi Oizumi, Naotsugu Tsuchiya, Shun-ichi Amari (2016)</w:t>
+      </w:r>
+    </w:p>
+    <w:p>
+      <w:pPr>
+        <w:keepNext/>
+        <w:keepLines/>
+        <w:widowControl/>
+        <w:ind w:left="432"/>
+      </w:pPr>
+      <w:r>
+        <w:t>Unified Framework for Information Integration Based on Information Geometry.</w:t>
+      </w:r>
+    </w:p>
+    <w:p>
+      <w:pPr>
+        <w:keepLines/>
+        <w:widowControl/>
+        <w:spacing w:after="240"/>
+        <w:ind w:left="432"/>
+      </w:pPr>
+      <w:r>
+        <w:t xml:space="preserve">Proceedings of the National Academy of Sciences, 113(51), 14817-14822. </w:t>
+      </w:r>
+      <w:hyperlink r:id="rId21">
+        <w:r>
+          <w:rPr>
+            <w:color w:val="1155CC"/>
+            <w:u w:val="single"/>
+          </w:rPr>
+          <w:t>DOI</w:t>
+        </w:r>
+      </w:hyperlink>
+      <w:r/>
+    </w:p>
+    <w:p>
+      <w:pPr>
+        <w:keepNext/>
+        <w:keepLines/>
+        <w:widowControl/>
+        <w:ind w:left="432" w:hanging="432"/>
+      </w:pPr>
+      <w:r>
+        <w:t>16. Melanie Boly, Shuntaro Sasai, Olivia Gosseries, Masafumi Oizumi, Adenauer Casali, Marcello Massimini, Giulio Tononi (2015)</w:t>
+      </w:r>
+    </w:p>
+    <w:p>
+      <w:pPr>
+        <w:keepNext/>
+        <w:keepLines/>
+        <w:widowControl/>
+        <w:ind w:left="432"/>
+      </w:pPr>
+      <w:r>
+        <w:t>Stimulus Set Meaningfulness and Neurophysiological Differentiation: A Functional Magnetic Resonance Imaging Study.</w:t>
+      </w:r>
+    </w:p>
+    <w:p>
+      <w:pPr>
+        <w:keepLines/>
+        <w:widowControl/>
+        <w:spacing w:after="240"/>
+        <w:ind w:left="432"/>
+      </w:pPr>
+      <w:r>
+        <w:t xml:space="preserve">PLoS ONE, 10(5): e0125337. </w:t>
       </w:r>
       <w:hyperlink r:id="rId57">
         <w:r>
@@ -2483,7 +2937,7 @@
         <w:ind w:left="432" w:hanging="432"/>
       </w:pPr>
       <w:r>
-        <w:t>13. Masafumi Oizumi, Ryota Satoh, Hokto Kazama, Masato Okada (2012)</w:t>
+        <w:t>15. Masafumi Oizumi*, Larissa Albantakis*, Giulio Tononi (2014)</w:t>
       </w:r>
     </w:p>
     <w:p>
@@ -2494,7 +2948,7 @@
         <w:ind w:left="432"/>
       </w:pPr>
       <w:r>
-        <w:t>Functional differences between global pre- and postsynaptic inhibition in the Drosophila olfactory circuit.</w:t>
+        <w:t>From the Phenomenology to the Mechanisms of Consciousness: Integrated Information Theory 3.0.</w:t>
       </w:r>
     </w:p>
     <w:p>
@@ -2505,7 +2959,50 @@
         <w:ind w:left="432"/>
       </w:pPr>
       <w:r>
-        <w:t xml:space="preserve">Frontiers in Computational Neuroscience, 6:14. </w:t>
+        <w:t xml:space="preserve">PLoS Computational Biology, 10, e1003588. *: equal contribution </w:t>
+      </w:r>
+      <w:hyperlink r:id="rId22">
+        <w:r>
+          <w:rPr>
+            <w:color w:val="1155CC"/>
+            <w:u w:val="single"/>
+          </w:rPr>
+          <w:t>DOI</w:t>
+        </w:r>
+      </w:hyperlink>
+      <w:r/>
+    </w:p>
+    <w:p>
+      <w:pPr>
+        <w:keepNext/>
+        <w:keepLines/>
+        <w:widowControl/>
+        <w:ind w:left="432" w:hanging="432"/>
+      </w:pPr>
+      <w:r>
+        <w:t>14. Akinori Mitani, Ryo Sasaki, Masafumi Oizumi, Takanori Uka (2013)</w:t>
+      </w:r>
+    </w:p>
+    <w:p>
+      <w:pPr>
+        <w:keepNext/>
+        <w:keepLines/>
+        <w:widowControl/>
+        <w:ind w:left="432"/>
+      </w:pPr>
+      <w:r>
+        <w:t>A leaky-integrator model as a control mechanism underlying flexible decision making during task switching.</w:t>
+      </w:r>
+    </w:p>
+    <w:p>
+      <w:pPr>
+        <w:keepLines/>
+        <w:widowControl/>
+        <w:spacing w:after="240"/>
+        <w:ind w:left="432"/>
+      </w:pPr>
+      <w:r>
+        <w:t xml:space="preserve">PLoS ONE, 8, e59670. </w:t>
       </w:r>
       <w:hyperlink r:id="rId58">
         <w:r>
@@ -2526,7 +3023,7 @@
         <w:ind w:left="432" w:hanging="432"/>
       </w:pPr>
       <w:r>
-        <w:t>12. Yasuhiko Igarashi, Masafumi Oizumi, Masato Okada (2012)</w:t>
+        <w:t>13. Masafumi Oizumi, Ryota Satoh, Hokto Kazama, Masato Okada (2012)</w:t>
       </w:r>
     </w:p>
     <w:p>
@@ -2537,7 +3034,7 @@
         <w:ind w:left="432"/>
       </w:pPr>
       <w:r>
-        <w:t>Theory of correlation in a network with synaptic depression.</w:t>
+        <w:t>Functional differences between global pre- and postsynaptic inhibition in the Drosophila olfactory circuit.</w:t>
       </w:r>
     </w:p>
     <w:p>
@@ -2548,7 +3045,7 @@
         <w:ind w:left="432"/>
       </w:pPr>
       <w:r>
-        <w:t xml:space="preserve">Physical Review E 85, 016108. </w:t>
+        <w:t xml:space="preserve">Frontiers in Computational Neuroscience, 6:14. </w:t>
       </w:r>
       <w:hyperlink r:id="rId59">
         <w:r>
@@ -2569,7 +3066,7 @@
         <w:ind w:left="432" w:hanging="432"/>
       </w:pPr>
       <w:r>
-        <w:t>11. Yosuke Otsubo, Kenji Nagata, Masafumi Oizumi, and Masato Okada (2011)</w:t>
+        <w:t>12. Yasuhiko Igarashi, Masafumi Oizumi, Masato Okada (2012)</w:t>
       </w:r>
     </w:p>
     <w:p>
@@ -2580,7 +3077,7 @@
         <w:ind w:left="432"/>
       </w:pPr>
       <w:r>
-        <w:t>Influence of synaptic depression on memory storage capacity.</w:t>
+        <w:t>Theory of correlation in a network with synaptic depression.</w:t>
       </w:r>
     </w:p>
     <w:p>
@@ -2591,7 +3088,7 @@
         <w:ind w:left="432"/>
       </w:pPr>
       <w:r>
-        <w:t xml:space="preserve">Journal of the Physical Society of Japan, 80, 084004. </w:t>
+        <w:t xml:space="preserve">Physical Review E 85, 016108. </w:t>
       </w:r>
       <w:hyperlink r:id="rId60">
         <w:r>
@@ -2612,7 +3109,7 @@
         <w:ind w:left="432" w:hanging="432"/>
       </w:pPr>
       <w:r>
-        <w:t>10. Masafumi Oizumi, Masato Okada, Shun-ichi Amari (2011)</w:t>
+        <w:t>11. Yosuke Otsubo, Kenji Nagata, Masafumi Oizumi, and Masato Okada (2011)</w:t>
       </w:r>
     </w:p>
     <w:p>
@@ -2623,7 +3120,7 @@
         <w:ind w:left="432"/>
       </w:pPr>
       <w:r>
-        <w:t>Information loss associated with imperfect observation and mismatched decoding.</w:t>
+        <w:t>Influence of synaptic depression on memory storage capacity.</w:t>
       </w:r>
     </w:p>
     <w:p>
@@ -2634,7 +3131,7 @@
         <w:ind w:left="432"/>
       </w:pPr>
       <w:r>
-        <w:t xml:space="preserve">Frontiers in Computational Neuroscience, 5:9. </w:t>
+        <w:t xml:space="preserve">Journal of the Physical Society of Japan, 80, 084004. </w:t>
       </w:r>
       <w:hyperlink r:id="rId61">
         <w:r>
@@ -2655,7 +3152,7 @@
         <w:ind w:left="432" w:hanging="432"/>
       </w:pPr>
       <w:r>
-        <w:t>9. Masafumi Oizumi, Keiji Miura, Masato Okada (2010)</w:t>
+        <w:t>10. Masafumi Oizumi, Masato Okada, Shun-ichi Amari (2011)</w:t>
       </w:r>
     </w:p>
     <w:p>
@@ -2666,7 +3163,7 @@
         <w:ind w:left="432"/>
       </w:pPr>
       <w:r>
-        <w:t>Analytical investigation of the effects of lateral connections on the accuracy of population coding.</w:t>
+        <w:t>Information loss associated with imperfect observation and mismatched decoding.</w:t>
       </w:r>
     </w:p>
     <w:p>
@@ -2677,7 +3174,7 @@
         <w:ind w:left="432"/>
       </w:pPr>
       <w:r>
-        <w:t xml:space="preserve">Physical Review E, 81, 051905. </w:t>
+        <w:t xml:space="preserve">Frontiers in Computational Neuroscience, 5:9. </w:t>
       </w:r>
       <w:hyperlink r:id="rId62">
         <w:r>
@@ -2698,7 +3195,7 @@
         <w:ind w:left="432" w:hanging="432"/>
       </w:pPr>
       <w:r>
-        <w:t>8. Yosuke Otsubo, Kenji Nagata, Masafumi Oizumi, Masato Okada (2010)</w:t>
+        <w:t>9. Masafumi Oizumi, Keiji Miura, Masato Okada (2010)</w:t>
       </w:r>
     </w:p>
     <w:p>
@@ -2709,7 +3206,7 @@
         <w:ind w:left="432"/>
       </w:pPr>
       <w:r>
-        <w:t>Instabilities in associative memory model with synaptic depression and switching phenomena among attractors.</w:t>
+        <w:t>Analytical investigation of the effects of lateral connections on the accuracy of population coding.</w:t>
       </w:r>
     </w:p>
     <w:p>
@@ -2720,7 +3217,7 @@
         <w:ind w:left="432"/>
       </w:pPr>
       <w:r>
-        <w:t xml:space="preserve">Journal of the Physical Society of Japan, 79, 084002. </w:t>
+        <w:t xml:space="preserve">Physical Review E, 81, 051905. </w:t>
       </w:r>
       <w:hyperlink r:id="rId63">
         <w:r>
@@ -2741,7 +3238,7 @@
         <w:ind w:left="432" w:hanging="432"/>
       </w:pPr>
       <w:r>
-        <w:t>7. Yasuhiko Igarashi, Masafumi Oizumi, Masato Okada (2010)</w:t>
+        <w:t>8. Yosuke Otsubo, Kenji Nagata, Masafumi Oizumi, Masato Okada (2010)</w:t>
       </w:r>
     </w:p>
     <w:p>
@@ -2752,7 +3249,7 @@
         <w:ind w:left="432"/>
       </w:pPr>
       <w:r>
-        <w:t>Mean field analysis of stochastic neural network models with synaptic depression.</w:t>
+        <w:t>Instabilities in associative memory model with synaptic depression and switching phenomena among attractors.</w:t>
       </w:r>
     </w:p>
     <w:p>
@@ -2763,7 +3260,7 @@
         <w:ind w:left="432"/>
       </w:pPr>
       <w:r>
-        <w:t xml:space="preserve">Journal of the Physical Society of Japan, 79, 084001. </w:t>
+        <w:t xml:space="preserve">Journal of the Physical Society of Japan, 79, 084002. </w:t>
       </w:r>
       <w:hyperlink r:id="rId64">
         <w:r>
@@ -2784,7 +3281,7 @@
         <w:ind w:left="432" w:hanging="432"/>
       </w:pPr>
       <w:r>
-        <w:t>6. Ryota Satoh*, Masafumi Oizumi*, Hokto Kazama, Masato Okada (2010)</w:t>
+        <w:t>7. Yasuhiko Igarashi, Masafumi Oizumi, Masato Okada (2010)</w:t>
       </w:r>
     </w:p>
     <w:p>
@@ -2795,7 +3292,7 @@
         <w:ind w:left="432"/>
       </w:pPr>
       <w:r>
-        <w:t>Mechanisms of maximum information preservation in the Drosophila antennal lobe.</w:t>
+        <w:t>Mean field analysis of stochastic neural network models with synaptic depression.</w:t>
       </w:r>
     </w:p>
     <w:p>
@@ -2806,7 +3303,7 @@
         <w:ind w:left="432"/>
       </w:pPr>
       <w:r>
-        <w:t xml:space="preserve">PLoS ONE, 5, e10644, 2010. *: equal contribution </w:t>
+        <w:t xml:space="preserve">Journal of the Physical Society of Japan, 79, 084001. </w:t>
       </w:r>
       <w:hyperlink r:id="rId65">
         <w:r>
@@ -2827,7 +3324,7 @@
         <w:ind w:left="432" w:hanging="432"/>
       </w:pPr>
       <w:r>
-        <w:t>5. Masafumi Oizumi, Toshiyuki Ishii, Kazuya Ishibashi, Toshihiko Hosoya, Masato Okada (2010)</w:t>
+        <w:t>6. Ryota Satoh*, Masafumi Oizumi*, Hokto Kazama, Masato Okada (2010)</w:t>
       </w:r>
     </w:p>
     <w:p>
@@ -2838,7 +3335,7 @@
         <w:ind w:left="432"/>
       </w:pPr>
       <w:r>
-        <w:t>Mismatched decoding in the brain.</w:t>
+        <w:t>Mechanisms of maximum information preservation in the Drosophila antennal lobe.</w:t>
       </w:r>
     </w:p>
     <w:p>
@@ -2849,9 +3346,52 @@
         <w:ind w:left="432"/>
       </w:pPr>
       <w:r>
+        <w:t xml:space="preserve">PLoS ONE, 5, e10644, 2010. *: equal contribution </w:t>
+      </w:r>
+      <w:hyperlink r:id="rId66">
+        <w:r>
+          <w:rPr>
+            <w:color w:val="1155CC"/>
+            <w:u w:val="single"/>
+          </w:rPr>
+          <w:t>DOI</w:t>
+        </w:r>
+      </w:hyperlink>
+      <w:r/>
+    </w:p>
+    <w:p>
+      <w:pPr>
+        <w:keepNext/>
+        <w:keepLines/>
+        <w:widowControl/>
+        <w:ind w:left="432" w:hanging="432"/>
+      </w:pPr>
+      <w:r>
+        <w:t>5. Masafumi Oizumi, Toshiyuki Ishii, Kazuya Ishibashi, Toshihiko Hosoya, Masato Okada (2010)</w:t>
+      </w:r>
+    </w:p>
+    <w:p>
+      <w:pPr>
+        <w:keepNext/>
+        <w:keepLines/>
+        <w:widowControl/>
+        <w:ind w:left="432"/>
+      </w:pPr>
+      <w:r>
+        <w:t>Mismatched decoding in the brain.</w:t>
+      </w:r>
+    </w:p>
+    <w:p>
+      <w:pPr>
+        <w:keepLines/>
+        <w:widowControl/>
+        <w:spacing w:after="240"/>
+        <w:ind w:left="432"/>
+      </w:pPr>
+      <w:r>
         <w:t xml:space="preserve">The Journal of Neuroscience, 30, 4815-4826. </w:t>
       </w:r>
-      <w:hyperlink r:id="rId66">
+      <w:hyperlink r:id="rId23">
         <w:r>
           <w:rPr>
             <w:color w:val="1155CC"/>

</xml_diff>

<commit_message>
Mark eLife perturbation paper as published and update CV
</commit_message>
<xml_diff>
--- a/cv/CV_Masafumi_Oizumi.docx
+++ b/cv/CV_Masafumi_Oizumi.docx
@@ -1000,7 +1000,7 @@
         <w:ind w:left="432" w:hanging="432"/>
       </w:pPr>
       <w:r>
-        <w:t>60. Tamami Nakano, Satoe Awada, Masafumi Oizumi, Daisuke Kuwano, Kazuyo Tanji, Nobumasa Kato, Noburo Saji (2026)</w:t>
+        <w:t>61. Tamami Nakano, Satoe Awada, Masafumi Oizumi, Daisuke Kuwano, Kazuyo Tanji, Nobumasa Kato, Noburo Saji (2026)</w:t>
       </w:r>
     </w:p>
     <w:p>
@@ -1043,7 +1043,7 @@
         <w:ind w:left="432" w:hanging="432"/>
       </w:pPr>
       <w:r>
-        <w:t>59. Ken Takeda, Masafumi Oizumi, Ryo Karakida (2026)</w:t>
+        <w:t>60. Ken Takeda, Masafumi Oizumi, Ryo Karakida (2026)</w:t>
       </w:r>
     </w:p>
     <w:p>
@@ -1086,7 +1086,7 @@
         <w:ind w:left="432" w:hanging="432"/>
       </w:pPr>
       <w:r>
-        <w:t>58. Soh Takahashi*, Masaru Sasaki*, Ken Takeda, Masafumi Oizumi (2026)</w:t>
+        <w:t>59. Mikito Ogino, Daiki Sekizawa, Jun Kitazono, and Masafumi Oizumi (2026)</w:t>
       </w:r>
     </w:p>
     <w:p>
@@ -1097,7 +1097,7 @@
         <w:ind w:left="432"/>
       </w:pPr>
       <w:r>
-        <w:t>Investigating Fine- and Coarse-grained Structural Correspondences Between Deep Neural Networks and Human Object Image Similarity Judgments Using Unsupervised Alignment.</w:t>
+        <w:t>Designing optimal perturbation inputs for system identification in neuroscience.</w:t>
       </w:r>
     </w:p>
     <w:p>
@@ -1108,7 +1108,7 @@
         <w:ind w:left="432"/>
       </w:pPr>
       <w:r>
-        <w:t xml:space="preserve">Neural Networks, 195, 108222. *: equal contribution. </w:t>
+        <w:t xml:space="preserve">eLife, 15, RP110030. </w:t>
       </w:r>
       <w:hyperlink r:id="rId26">
         <w:r>
@@ -1129,6 +1129,49 @@
         <w:ind w:left="432" w:hanging="432"/>
       </w:pPr>
       <w:r>
+        <w:t>58. Soh Takahashi*, Masaru Sasaki*, Ken Takeda, Masafumi Oizumi (2026)</w:t>
+      </w:r>
+    </w:p>
+    <w:p>
+      <w:pPr>
+        <w:keepNext/>
+        <w:keepLines/>
+        <w:widowControl/>
+        <w:ind w:left="432"/>
+      </w:pPr>
+      <w:r>
+        <w:t>Investigating Fine- and Coarse-grained Structural Correspondences Between Deep Neural Networks and Human Object Image Similarity Judgments Using Unsupervised Alignment.</w:t>
+      </w:r>
+    </w:p>
+    <w:p>
+      <w:pPr>
+        <w:keepLines/>
+        <w:widowControl/>
+        <w:spacing w:after="240"/>
+        <w:ind w:left="432"/>
+      </w:pPr>
+      <w:r>
+        <w:t xml:space="preserve">Neural Networks, 195, 108222. *: equal contribution. </w:t>
+      </w:r>
+      <w:hyperlink r:id="rId27">
+        <w:r>
+          <w:rPr>
+            <w:color w:val="1155CC"/>
+            <w:u w:val="single"/>
+          </w:rPr>
+          <w:t>DOI</w:t>
+        </w:r>
+      </w:hyperlink>
+      <w:r/>
+    </w:p>
+    <w:p>
+      <w:pPr>
+        <w:keepNext/>
+        <w:keepLines/>
+        <w:widowControl/>
+        <w:ind w:left="432" w:hanging="432"/>
+      </w:pPr>
+      <w:r>
         <w:t>57. Daiki Sekizawa, Sosuke Ito, Masafumi Oizumi (2026)</w:t>
       </w:r>
     </w:p>
@@ -1196,7 +1239,7 @@
       <w:r>
         <w:t xml:space="preserve">Scientific Data, advance online publication. </w:t>
       </w:r>
-      <w:hyperlink r:id="rId27">
+      <w:hyperlink r:id="rId28">
         <w:r>
           <w:rPr>
             <w:color w:val="1155CC"/>
@@ -1282,7 +1325,7 @@
       <w:r>
         <w:t xml:space="preserve">The Journal of Neuroscience, 46(5), e0364252025. </w:t>
       </w:r>
-      <w:hyperlink r:id="rId28">
+      <w:hyperlink r:id="rId29">
         <w:r>
           <w:rPr>
             <w:color w:val="1155CC"/>
@@ -1368,49 +1411,6 @@
       <w:r>
         <w:t xml:space="preserve">The Journal of Neuroscience, 45(17), e0802242025. </w:t>
       </w:r>
-      <w:hyperlink r:id="rId29">
-        <w:r>
-          <w:rPr>
-            <w:color w:val="1155CC"/>
-            <w:u w:val="single"/>
-          </w:rPr>
-          <w:t>DOI</w:t>
-        </w:r>
-      </w:hyperlink>
-      <w:r/>
-    </w:p>
-    <w:p>
-      <w:pPr>
-        <w:keepNext/>
-        <w:keepLines/>
-        <w:widowControl/>
-        <w:ind w:left="432" w:hanging="432"/>
-      </w:pPr>
-      <w:r>
-        <w:t>51. Tononi G, Albantakis L, Barbosa L, Boly M, Cirelli C, Comolatti R, Ellia F, Findlay G, Girardi Casali A, Grasso M, Haun AM, Hendren J, Hoel E, Koch C, Maier A, Marshall W, Massimini M, Mayner WGP, Oizumi M, Szczotka J, Tsuchiya N, Zaeemzadeh A (2025)</w:t>
-      </w:r>
-    </w:p>
-    <w:p>
-      <w:pPr>
-        <w:keepNext/>
-        <w:keepLines/>
-        <w:widowControl/>
-        <w:ind w:left="432"/>
-      </w:pPr>
-      <w:r>
-        <w:t>Consciousness or pseudo-consciousness? A clash of two paradigms.</w:t>
-      </w:r>
-    </w:p>
-    <w:p>
-      <w:pPr>
-        <w:keepLines/>
-        <w:widowControl/>
-        <w:spacing w:after="240"/>
-        <w:ind w:left="432"/>
-      </w:pPr>
-      <w:r>
-        <w:t xml:space="preserve">Nature Neuroscience, 28, 694–702. </w:t>
-      </w:r>
       <w:hyperlink r:id="rId30">
         <w:r>
           <w:rPr>
@@ -1430,7 +1430,7 @@
         <w:ind w:left="432" w:hanging="432"/>
       </w:pPr>
       <w:r>
-        <w:t>50. Tadahiro Taniguchi, Masafumi Oizumi, Noburo Saji, Takato Horii, and Naotsugu Tsuchiya (2025)</w:t>
+        <w:t>51. Tononi G, Albantakis L, Barbosa L, Boly M, Cirelli C, Comolatti R, Ellia F, Findlay G, Girardi Casali A, Grasso M, Haun AM, Hendren J, Hoel E, Koch C, Maier A, Marshall W, Massimini M, Mayner WGP, Oizumi M, Szczotka J, Tsuchiya N, Zaeemzadeh A (2025)</w:t>
       </w:r>
     </w:p>
     <w:p>
@@ -1441,7 +1441,7 @@
         <w:ind w:left="432"/>
       </w:pPr>
       <w:r>
-        <w:t>Constructive approach to bidirectional influence between qualia structure and language emergence.</w:t>
+        <w:t>Consciousness or pseudo-consciousness? A clash of two paradigms.</w:t>
       </w:r>
     </w:p>
     <w:p>
@@ -1452,7 +1452,7 @@
         <w:ind w:left="432"/>
       </w:pPr>
       <w:r>
-        <w:t xml:space="preserve">Philosophy and the Mind Sciences, 6. </w:t>
+        <w:t xml:space="preserve">Nature Neuroscience, 28, 694–702. </w:t>
       </w:r>
       <w:hyperlink r:id="rId31">
         <w:r>
@@ -1473,7 +1473,7 @@
         <w:ind w:left="432" w:hanging="432"/>
       </w:pPr>
       <w:r>
-        <w:t>49. Haruka Asanuma, Naoko Koide-Majima, Ken Nakamura, Takato Horii, Shinji Nishimoto, Masafumi Oizumi (2025)</w:t>
+        <w:t>50. Tadahiro Taniguchi, Masafumi Oizumi, Noburo Saji, Takato Horii, and Naotsugu Tsuchiya (2025)</w:t>
       </w:r>
     </w:p>
     <w:p>
@@ -1484,7 +1484,7 @@
         <w:ind w:left="432"/>
       </w:pPr>
       <w:r>
-        <w:t>Correspondence of high dimensional emotion structures elicited from video clips between humans and multimodal LLMs.</w:t>
+        <w:t>Constructive approach to bidirectional influence between qualia structure and language emergence.</w:t>
       </w:r>
     </w:p>
     <w:p>
@@ -1495,7 +1495,7 @@
         <w:ind w:left="432"/>
       </w:pPr>
       <w:r>
-        <w:t xml:space="preserve">Scientific Reports, 15, 32175. </w:t>
+        <w:t xml:space="preserve">Philosophy and the Mind Sciences, 6. </w:t>
       </w:r>
       <w:hyperlink r:id="rId32">
         <w:r>
@@ -1516,7 +1516,7 @@
         <w:ind w:left="432" w:hanging="432"/>
       </w:pPr>
       <w:r>
-        <w:t>48. Asaki Kataoka, Yoshihiro Nagano, and Masafumi Oizumi (2025)</w:t>
+        <w:t>49. Haruka Asanuma, Naoko Koide-Majima, Ken Nakamura, Takato Horii, Shinji Nishimoto, Masafumi Oizumi (2025)</w:t>
       </w:r>
     </w:p>
     <w:p>
@@ -1527,7 +1527,7 @@
         <w:ind w:left="432"/>
       </w:pPr>
       <w:r>
-        <w:t>Exploring internal representations of self-supervised networks: few-shot learning abilities and comparison with human semantics and recognition of objects.</w:t>
+        <w:t>Correspondence of high dimensional emotion structures elicited from video clips between humans and multimodal LLMs.</w:t>
       </w:r>
     </w:p>
     <w:p>
@@ -1538,7 +1538,7 @@
         <w:ind w:left="432"/>
       </w:pPr>
       <w:r>
-        <w:t xml:space="preserve">Frontiers in Computational Neuroscience, 19, 1613291. </w:t>
+        <w:t xml:space="preserve">Scientific Reports, 15, 32175. </w:t>
       </w:r>
       <w:hyperlink r:id="rId33">
         <w:r>
@@ -1559,6 +1559,49 @@
         <w:ind w:left="432" w:hanging="432"/>
       </w:pPr>
       <w:r>
+        <w:t>48. Asaki Kataoka, Yoshihiro Nagano, and Masafumi Oizumi (2025)</w:t>
+      </w:r>
+    </w:p>
+    <w:p>
+      <w:pPr>
+        <w:keepNext/>
+        <w:keepLines/>
+        <w:widowControl/>
+        <w:ind w:left="432"/>
+      </w:pPr>
+      <w:r>
+        <w:t>Exploring internal representations of self-supervised networks: few-shot learning abilities and comparison with human semantics and recognition of objects.</w:t>
+      </w:r>
+    </w:p>
+    <w:p>
+      <w:pPr>
+        <w:keepLines/>
+        <w:widowControl/>
+        <w:spacing w:after="240"/>
+        <w:ind w:left="432"/>
+      </w:pPr>
+      <w:r>
+        <w:t xml:space="preserve">Frontiers in Computational Neuroscience, 19, 1613291. </w:t>
+      </w:r>
+      <w:hyperlink r:id="rId34">
+        <w:r>
+          <w:rPr>
+            <w:color w:val="1155CC"/>
+            <w:u w:val="single"/>
+          </w:rPr>
+          <w:t>DOI</w:t>
+        </w:r>
+      </w:hyperlink>
+      <w:r/>
+    </w:p>
+    <w:p>
+      <w:pPr>
+        <w:keepNext/>
+        <w:keepLines/>
+        <w:widowControl/>
+        <w:ind w:left="432" w:hanging="432"/>
+      </w:pPr>
+      <w:r>
         <w:t>47. Genji Kawakita*, Ariel Zeleznikow-Johnston*, Ken Takeda*, Naotsugu Tsuchiya**, Masafumi Oizumi** (2025)</w:t>
       </w:r>
     </w:p>
@@ -1626,49 +1669,6 @@
       <w:r>
         <w:t xml:space="preserve">Neuroscience of Consciousness, 2025(1), niaf053. </w:t>
       </w:r>
-      <w:hyperlink r:id="rId34">
-        <w:r>
-          <w:rPr>
-            <w:color w:val="1155CC"/>
-            <w:u w:val="single"/>
-          </w:rPr>
-          <w:t>DOI</w:t>
-        </w:r>
-      </w:hyperlink>
-      <w:r/>
-    </w:p>
-    <w:p>
-      <w:pPr>
-        <w:keepNext/>
-        <w:keepLines/>
-        <w:widowControl/>
-        <w:ind w:left="432" w:hanging="432"/>
-      </w:pPr>
-      <w:r>
-        <w:t>45. Asaki Kataoka, Nipun Ravindu Wickramanayaka, Yu Togashi, Masafumi Oizumi (2025)</w:t>
-      </w:r>
-    </w:p>
-    <w:p>
-      <w:pPr>
-        <w:keepNext/>
-        <w:keepLines/>
-        <w:widowControl/>
-        <w:ind w:left="432"/>
-      </w:pPr>
-      <w:r>
-        <w:t>Spontaneous organization of diverse human color representations: from trichromacy to dichromacy in neural networks trained with retina-like inputs.</w:t>
-      </w:r>
-    </w:p>
-    <w:p>
-      <w:pPr>
-        <w:keepLines/>
-        <w:widowControl/>
-        <w:spacing w:after="240"/>
-        <w:ind w:left="432"/>
-      </w:pPr>
-      <w:r>
-        <w:t xml:space="preserve">In International Conference on Machine Learning and Applications (ICMLA), 1137-1142. </w:t>
-      </w:r>
       <w:hyperlink r:id="rId35">
         <w:r>
           <w:rPr>
@@ -1688,6 +1688,49 @@
         <w:ind w:left="432" w:hanging="432"/>
       </w:pPr>
       <w:r>
+        <w:t>45. Asaki Kataoka, Nipun Ravindu Wickramanayaka, Yu Togashi, Masafumi Oizumi (2025)</w:t>
+      </w:r>
+    </w:p>
+    <w:p>
+      <w:pPr>
+        <w:keepNext/>
+        <w:keepLines/>
+        <w:widowControl/>
+        <w:ind w:left="432"/>
+      </w:pPr>
+      <w:r>
+        <w:t>Spontaneous organization of diverse human color representations: from trichromacy to dichromacy in neural networks trained with retina-like inputs.</w:t>
+      </w:r>
+    </w:p>
+    <w:p>
+      <w:pPr>
+        <w:keepLines/>
+        <w:widowControl/>
+        <w:spacing w:after="240"/>
+        <w:ind w:left="432"/>
+      </w:pPr>
+      <w:r>
+        <w:t xml:space="preserve">In International Conference on Machine Learning and Applications (ICMLA), 1137-1142. </w:t>
+      </w:r>
+      <w:hyperlink r:id="rId36">
+        <w:r>
+          <w:rPr>
+            <w:color w:val="1155CC"/>
+            <w:u w:val="single"/>
+          </w:rPr>
+          <w:t>DOI</w:t>
+        </w:r>
+      </w:hyperlink>
+      <w:r/>
+    </w:p>
+    <w:p>
+      <w:pPr>
+        <w:keepNext/>
+        <w:keepLines/>
+        <w:widowControl/>
+        <w:ind w:left="432" w:hanging="432"/>
+      </w:pPr>
+      <w:r>
         <w:t>44. Ken Takeda*, Masaru Sasaki*, Kota Abe, Masafumi Oizumi (2025)</w:t>
       </w:r>
     </w:p>
@@ -1767,49 +1810,6 @@
       <w:r>
         <w:t xml:space="preserve">iScience, 28(5), 112427. *: equal contribution. </w:t>
       </w:r>
-      <w:hyperlink r:id="rId36">
-        <w:r>
-          <w:rPr>
-            <w:color w:val="1155CC"/>
-            <w:u w:val="single"/>
-          </w:rPr>
-          <w:t>DOI</w:t>
-        </w:r>
-      </w:hyperlink>
-      <w:r/>
-    </w:p>
-    <w:p>
-      <w:pPr>
-        <w:keepNext/>
-        <w:keepLines/>
-        <w:widowControl/>
-        <w:ind w:left="432" w:hanging="432"/>
-      </w:pPr>
-      <w:r>
-        <w:t>42. Shunsuke Kamiya, Taiga Mitamura, Muneki Ikeda, Masafumi Oizumi (2025)</w:t>
-      </w:r>
-    </w:p>
-    <w:p>
-      <w:pPr>
-        <w:keepNext/>
-        <w:keepLines/>
-        <w:widowControl/>
-        <w:ind w:left="432"/>
-      </w:pPr>
-      <w:r>
-        <w:t>Unsupervised Neuronal Matching with Spontaneous Neuronal Activity.</w:t>
-      </w:r>
-    </w:p>
-    <w:p>
-      <w:pPr>
-        <w:keepLines/>
-        <w:widowControl/>
-        <w:spacing w:after="240"/>
-        <w:ind w:left="432"/>
-      </w:pPr>
-      <w:r>
-        <w:t xml:space="preserve">In ICLR 2025 Workshop on Representational Alignment. </w:t>
-      </w:r>
       <w:hyperlink r:id="rId37">
         <w:r>
           <w:rPr>
@@ -1829,6 +1829,49 @@
         <w:ind w:left="432" w:hanging="432"/>
       </w:pPr>
       <w:r>
+        <w:t>42. Shunsuke Kamiya, Taiga Mitamura, Muneki Ikeda, Masafumi Oizumi (2025)</w:t>
+      </w:r>
+    </w:p>
+    <w:p>
+      <w:pPr>
+        <w:keepNext/>
+        <w:keepLines/>
+        <w:widowControl/>
+        <w:ind w:left="432"/>
+      </w:pPr>
+      <w:r>
+        <w:t>Unsupervised Neuronal Matching with Spontaneous Neuronal Activity.</w:t>
+      </w:r>
+    </w:p>
+    <w:p>
+      <w:pPr>
+        <w:keepLines/>
+        <w:widowControl/>
+        <w:spacing w:after="240"/>
+        <w:ind w:left="432"/>
+      </w:pPr>
+      <w:r>
+        <w:t xml:space="preserve">In ICLR 2025 Workshop on Representational Alignment. </w:t>
+      </w:r>
+      <w:hyperlink r:id="rId38">
+        <w:r>
+          <w:rPr>
+            <w:color w:val="1155CC"/>
+            <w:u w:val="single"/>
+          </w:rPr>
+          <w:t>DOI</w:t>
+        </w:r>
+      </w:hyperlink>
+      <w:r/>
+    </w:p>
+    <w:p>
+      <w:pPr>
+        <w:keepNext/>
+        <w:keepLines/>
+        <w:widowControl/>
+        <w:ind w:left="432" w:hanging="432"/>
+      </w:pPr>
+      <w:r>
         <w:t>41. Daiki Sekizawa, Sosuke Ito, Masafumi Oizumi (2024)</w:t>
       </w:r>
     </w:p>
@@ -1896,49 +1939,6 @@
       <w:r>
         <w:t xml:space="preserve">Scientific Reports 14 (1), 15917. </w:t>
       </w:r>
-      <w:hyperlink r:id="rId38">
-        <w:r>
-          <w:rPr>
-            <w:color w:val="1155CC"/>
-            <w:u w:val="single"/>
-          </w:rPr>
-          <w:t>DOI</w:t>
-        </w:r>
-      </w:hyperlink>
-      <w:r/>
-    </w:p>
-    <w:p>
-      <w:pPr>
-        <w:keepNext/>
-        <w:keepLines/>
-        <w:widowControl/>
-        <w:ind w:left="432" w:hanging="432"/>
-      </w:pPr>
-      <w:r>
-        <w:t>39. Shunsuke Kamiya, Jun Kitazono, Masafumi Oizumi (2024)</w:t>
-      </w:r>
-    </w:p>
-    <w:p>
-      <w:pPr>
-        <w:keepNext/>
-        <w:keepLines/>
-        <w:widowControl/>
-        <w:ind w:left="432"/>
-      </w:pPr>
-      <w:r>
-        <w:t>Koopman Operator Based Dynamical Similarity Analysis for Data-driven Quantification of Distance between Dynamics.</w:t>
-      </w:r>
-    </w:p>
-    <w:p>
-      <w:pPr>
-        <w:keepLines/>
-        <w:widowControl/>
-        <w:spacing w:after="240"/>
-        <w:ind w:left="432"/>
-      </w:pPr>
-      <w:r>
-        <w:t xml:space="preserve">In ICLR 2024 Workshop on Representational Alignment. </w:t>
-      </w:r>
       <w:hyperlink r:id="rId39">
         <w:r>
           <w:rPr>
@@ -1958,7 +1958,7 @@
         <w:ind w:left="432" w:hanging="432"/>
       </w:pPr>
       <w:r>
-        <w:t>38. Soh Takahashi, Masaru Sasaki, Ken Takeda, Masafumi Oizumi (2024)</w:t>
+        <w:t>39. Shunsuke Kamiya, Jun Kitazono, Masafumi Oizumi (2024)</w:t>
       </w:r>
     </w:p>
     <w:p>
@@ -1969,7 +1969,7 @@
         <w:ind w:left="432"/>
       </w:pPr>
       <w:r>
-        <w:t>Self-supervised learning facilitates neural representation structures that can be unsupervisedly aligned to human behaviors.</w:t>
+        <w:t>Koopman Operator Based Dynamical Similarity Analysis for Data-driven Quantification of Distance between Dynamics.</w:t>
       </w:r>
     </w:p>
     <w:p>
@@ -2001,6 +2001,49 @@
         <w:ind w:left="432" w:hanging="432"/>
       </w:pPr>
       <w:r>
+        <w:t>38. Soh Takahashi, Masaru Sasaki, Ken Takeda, Masafumi Oizumi (2024)</w:t>
+      </w:r>
+    </w:p>
+    <w:p>
+      <w:pPr>
+        <w:keepNext/>
+        <w:keepLines/>
+        <w:widowControl/>
+        <w:ind w:left="432"/>
+      </w:pPr>
+      <w:r>
+        <w:t>Self-supervised learning facilitates neural representation structures that can be unsupervisedly aligned to human behaviors.</w:t>
+      </w:r>
+    </w:p>
+    <w:p>
+      <w:pPr>
+        <w:keepLines/>
+        <w:widowControl/>
+        <w:spacing w:after="240"/>
+        <w:ind w:left="432"/>
+      </w:pPr>
+      <w:r>
+        <w:t xml:space="preserve">In ICLR 2024 Workshop on Representational Alignment. </w:t>
+      </w:r>
+      <w:hyperlink r:id="rId41">
+        <w:r>
+          <w:rPr>
+            <w:color w:val="1155CC"/>
+            <w:u w:val="single"/>
+          </w:rPr>
+          <w:t>DOI</w:t>
+        </w:r>
+      </w:hyperlink>
+      <w:r/>
+    </w:p>
+    <w:p>
+      <w:pPr>
+        <w:keepNext/>
+        <w:keepLines/>
+        <w:widowControl/>
+        <w:ind w:left="432" w:hanging="432"/>
+      </w:pPr>
+      <w:r>
         <w:t>37. Jun Kitazono, Yuma Aoki, Masafumi Oizumi (2023)</w:t>
       </w:r>
     </w:p>
@@ -2111,49 +2154,6 @@
       <w:r>
         <w:t xml:space="preserve">Network Neuroscience, 6 (1), 118–134. </w:t>
       </w:r>
-      <w:hyperlink r:id="rId41">
-        <w:r>
-          <w:rPr>
-            <w:color w:val="1155CC"/>
-            <w:u w:val="single"/>
-          </w:rPr>
-          <w:t>DOI</w:t>
-        </w:r>
-      </w:hyperlink>
-      <w:r/>
-    </w:p>
-    <w:p>
-      <w:pPr>
-        <w:keepNext/>
-        <w:keepLines/>
-        <w:widowControl/>
-        <w:ind w:left="432" w:hanging="432"/>
-      </w:pPr>
-      <w:r>
-        <w:t>34. Keisuke Ota, Yasuhiro Oisi, Takayuki Suzuki, Muneki Ikeda, Yoshiki Ito, Tsubasa Ito, Hiroyuki Uwamori, Kenta Kobayashi, Midori Kobayashi, Maya Odagawa, Chie Matsubara, Yoshinori Kuroiwa, Masaru Horikoshi, Junya Matsushita, Hiroyuki Hioki, Masamichi Ohkura, Junichi Nakai, Masafumi Oizumi, Atsushi Miyawaki, Toru Aonishi, Takahiro Ode, Masanori Murayama (2021)</w:t>
-      </w:r>
-    </w:p>
-    <w:p>
-      <w:pPr>
-        <w:keepNext/>
-        <w:keepLines/>
-        <w:widowControl/>
-        <w:ind w:left="432"/>
-      </w:pPr>
-      <w:r>
-        <w:t>Fast, cell-resolution, contiguous-wide two-photon imaging to reveal functional network architectures across multi-modal cortical areas.</w:t>
-      </w:r>
-    </w:p>
-    <w:p>
-      <w:pPr>
-        <w:keepLines/>
-        <w:widowControl/>
-        <w:spacing w:after="240"/>
-        <w:ind w:left="432"/>
-      </w:pPr>
-      <w:r>
-        <w:t xml:space="preserve">Neuron, 109(11), 1810-1824.e9. </w:t>
-      </w:r>
       <w:hyperlink r:id="rId42">
         <w:r>
           <w:rPr>
@@ -2173,7 +2173,7 @@
         <w:ind w:left="432" w:hanging="432"/>
       </w:pPr>
       <w:r>
-        <w:t>33. Kotaro Ishizu, Tomoyo I. Shiramatsu, Rie Hitsuyu, Masafumi Oizumi, Naotsugu Tsuchiya, Hirokazu Takahashi (2021)</w:t>
+        <w:t>34. Keisuke Ota, Yasuhiro Oisi, Takayuki Suzuki, Muneki Ikeda, Yoshiki Ito, Tsubasa Ito, Hiroyuki Uwamori, Kenta Kobayashi, Midori Kobayashi, Maya Odagawa, Chie Matsubara, Yoshinori Kuroiwa, Masaru Horikoshi, Junya Matsushita, Hiroyuki Hioki, Masamichi Ohkura, Junichi Nakai, Masafumi Oizumi, Atsushi Miyawaki, Toru Aonishi, Takahiro Ode, Masanori Murayama (2021)</w:t>
       </w:r>
     </w:p>
     <w:p>
@@ -2184,7 +2184,7 @@
         <w:ind w:left="432"/>
       </w:pPr>
       <w:r>
-        <w:t>Information flow in the rat thalamo-cortical system: spontaneous vs. stimulus-evoked activities.</w:t>
+        <w:t>Fast, cell-resolution, contiguous-wide two-photon imaging to reveal functional network architectures across multi-modal cortical areas.</w:t>
       </w:r>
     </w:p>
     <w:p>
@@ -2195,7 +2195,7 @@
         <w:ind w:left="432"/>
       </w:pPr>
       <w:r>
-        <w:t xml:space="preserve">Scientific Reports, 11(19252). </w:t>
+        <w:t xml:space="preserve">Neuron, 109(11), 1810-1824.e9. </w:t>
       </w:r>
       <w:hyperlink r:id="rId43">
         <w:r>
@@ -2216,7 +2216,7 @@
         <w:ind w:left="432" w:hanging="432"/>
       </w:pPr>
       <w:r>
-        <w:t>32. Dror Cohen, Shuntaro Sasai, Naotsugu Tsuchiya, Masafumi Oizumi (2020)</w:t>
+        <w:t>33. Kotaro Ishizu, Tomoyo I. Shiramatsu, Rie Hitsuyu, Masafumi Oizumi, Naotsugu Tsuchiya, Hirokazu Takahashi (2021)</w:t>
       </w:r>
     </w:p>
     <w:p>
@@ -2227,7 +2227,7 @@
         <w:ind w:left="432"/>
       </w:pPr>
       <w:r>
-        <w:t>A general spectral decomposition of causal influences applied to integrated information.</w:t>
+        <w:t>Information flow in the rat thalamo-cortical system: spontaneous vs. stimulus-evoked activities.</w:t>
       </w:r>
     </w:p>
     <w:p>
@@ -2238,7 +2238,7 @@
         <w:ind w:left="432"/>
       </w:pPr>
       <w:r>
-        <w:t xml:space="preserve">The Journal of Neuroscience Methods, 330, 108443. </w:t>
+        <w:t xml:space="preserve">Scientific Reports, 11(19252). </w:t>
       </w:r>
       <w:hyperlink r:id="rId44">
         <w:r>
@@ -2259,7 +2259,7 @@
         <w:ind w:left="432" w:hanging="432"/>
       </w:pPr>
       <w:r>
-        <w:t>31. Akihiro Eguchi, Takato Horii, Takayuki Nagai, Ryota Kanai, Masafumi Oizumi (2020)</w:t>
+        <w:t>32. Dror Cohen, Shuntaro Sasai, Naotsugu Tsuchiya, Masafumi Oizumi (2020)</w:t>
       </w:r>
     </w:p>
     <w:p>
@@ -2270,7 +2270,7 @@
         <w:ind w:left="432"/>
       </w:pPr>
       <w:r>
-        <w:t>An Information Theoretic Approach to Reveal the Formation of Shared Representations.</w:t>
+        <w:t>A general spectral decomposition of causal influences applied to integrated information.</w:t>
       </w:r>
     </w:p>
     <w:p>
@@ -2281,7 +2281,7 @@
         <w:ind w:left="432"/>
       </w:pPr>
       <w:r>
-        <w:t xml:space="preserve">Frontiers in Computational Neuroscience. </w:t>
+        <w:t xml:space="preserve">The Journal of Neuroscience Methods, 330, 108443. </w:t>
       </w:r>
       <w:hyperlink r:id="rId45">
         <w:r>
@@ -2302,7 +2302,7 @@
         <w:ind w:left="432" w:hanging="432"/>
       </w:pPr>
       <w:r>
-        <w:t>30. Jun Kitazono, Ryota Kanai, Masafumi Oizumi (2020)</w:t>
+        <w:t>31. Akihiro Eguchi, Takato Horii, Takayuki Nagai, Ryota Kanai, Masafumi Oizumi (2020)</w:t>
       </w:r>
     </w:p>
     <w:p>
@@ -2313,7 +2313,7 @@
         <w:ind w:left="432"/>
       </w:pPr>
       <w:r>
-        <w:t>Efficient search for informational cores in complex systems: Application to brain networks.</w:t>
+        <w:t>An Information Theoretic Approach to Reveal the Formation of Shared Representations.</w:t>
       </w:r>
     </w:p>
     <w:p>
@@ -2324,7 +2324,7 @@
         <w:ind w:left="432"/>
       </w:pPr>
       <w:r>
-        <w:t xml:space="preserve">Neural Networks, 132, 232-244. </w:t>
+        <w:t xml:space="preserve">Frontiers in Computational Neuroscience. </w:t>
       </w:r>
       <w:hyperlink r:id="rId46">
         <w:r>
@@ -2345,7 +2345,7 @@
         <w:ind w:left="432" w:hanging="432"/>
       </w:pPr>
       <w:r>
-        <w:t>29. Sosuke Ito, Masafumi Oizumi, and Shun-ichi Amari (2020)</w:t>
+        <w:t>30. Jun Kitazono, Ryota Kanai, Masafumi Oizumi (2020)</w:t>
       </w:r>
     </w:p>
     <w:p>
@@ -2356,7 +2356,7 @@
         <w:ind w:left="432"/>
       </w:pPr>
       <w:r>
-        <w:t>Unified framework for the entropy production and the stochastic interaction based on information geometry.</w:t>
+        <w:t>Efficient search for informational cores in complex systems: Application to brain networks.</w:t>
       </w:r>
     </w:p>
     <w:p>
@@ -2367,7 +2367,7 @@
         <w:ind w:left="432"/>
       </w:pPr>
       <w:r>
-        <w:t xml:space="preserve">Physical Review Research, 2, 033048. </w:t>
+        <w:t xml:space="preserve">Neural Networks, 132, 232-244. </w:t>
       </w:r>
       <w:hyperlink r:id="rId47">
         <w:r>
@@ -2388,7 +2388,7 @@
         <w:ind w:left="432" w:hanging="432"/>
       </w:pPr>
       <w:r>
-        <w:t>28. Shun-ichi Amari, Ryo Karakida, Masafumi Oizumi (2019)</w:t>
+        <w:t>29. Sosuke Ito, Masafumi Oizumi, and Shun-ichi Amari (2020)</w:t>
       </w:r>
     </w:p>
     <w:p>
@@ -2399,7 +2399,7 @@
         <w:ind w:left="432"/>
       </w:pPr>
       <w:r>
-        <w:t>Fisher Information and Natural Gradient Learning in Random Deep Networks.</w:t>
+        <w:t>Unified framework for the entropy production and the stochastic interaction based on information geometry.</w:t>
       </w:r>
     </w:p>
     <w:p>
@@ -2410,7 +2410,7 @@
         <w:ind w:left="432"/>
       </w:pPr>
       <w:r>
-        <w:t xml:space="preserve">Proceedings of Machine Learning Research, in PMLR 89:694-702. </w:t>
+        <w:t xml:space="preserve">Physical Review Research, 2, 033048. </w:t>
       </w:r>
       <w:hyperlink r:id="rId48">
         <w:r>
@@ -2431,7 +2431,7 @@
         <w:ind w:left="432" w:hanging="432"/>
       </w:pPr>
       <w:r>
-        <w:t>27. Shun-ichi Amari, Ryo Karakida, Masafumi Oizumi, Marco Cuturi (2019)</w:t>
+        <w:t>28. Shun-ichi Amari, Ryo Karakida, Masafumi Oizumi (2019)</w:t>
       </w:r>
     </w:p>
     <w:p>
@@ -2442,7 +2442,7 @@
         <w:ind w:left="432"/>
       </w:pPr>
       <w:r>
-        <w:t>Information Geometry for Regularized Optimal Transport and Barycenters of Patterns.</w:t>
+        <w:t>Fisher Information and Natural Gradient Learning in Random Deep Networks.</w:t>
       </w:r>
     </w:p>
     <w:p>
@@ -2453,7 +2453,7 @@
         <w:ind w:left="432"/>
       </w:pPr>
       <w:r>
-        <w:t xml:space="preserve">Neural Computation, 31(5), 827-848. </w:t>
+        <w:t xml:space="preserve">Proceedings of Machine Learning Research, in PMLR 89:694-702. </w:t>
       </w:r>
       <w:hyperlink r:id="rId49">
         <w:r>
@@ -2474,7 +2474,7 @@
         <w:ind w:left="432" w:hanging="432"/>
       </w:pPr>
       <w:r>
-        <w:t>26. Shun-ichi Amari, Ryo Karakida, Masafumi Oizumi (2019)</w:t>
+        <w:t>27. Shun-ichi Amari, Ryo Karakida, Masafumi Oizumi, Marco Cuturi (2019)</w:t>
       </w:r>
     </w:p>
     <w:p>
@@ -2485,7 +2485,7 @@
         <w:ind w:left="432"/>
       </w:pPr>
       <w:r>
-        <w:t>Statistical Neurodynamics of Deep Networks: Geometry of Signal Spaces.</w:t>
+        <w:t>Information Geometry for Regularized Optimal Transport and Barycenters of Patterns.</w:t>
       </w:r>
     </w:p>
     <w:p>
@@ -2496,7 +2496,7 @@
         <w:ind w:left="432"/>
       </w:pPr>
       <w:r>
-        <w:t xml:space="preserve">Nonlinear Theory and Its Applications, IEICE, 10(4), 322-336. </w:t>
+        <w:t xml:space="preserve">Neural Computation, 31(5), 827-848. </w:t>
       </w:r>
       <w:hyperlink r:id="rId50">
         <w:r>
@@ -2517,7 +2517,7 @@
         <w:ind w:left="432" w:hanging="432"/>
       </w:pPr>
       <w:r>
-        <w:t>25. Jun Kitazono, Ryota Kanai, Masafumi Oizumi (2018)</w:t>
+        <w:t>26. Shun-ichi Amari, Ryo Karakida, Masafumi Oizumi (2019)</w:t>
       </w:r>
     </w:p>
     <w:p>
@@ -2528,7 +2528,7 @@
         <w:ind w:left="432"/>
       </w:pPr>
       <w:r>
-        <w:t>Efficient Algorithms for Searching the Minimum Information Partition in Integrated Information Theory.</w:t>
+        <w:t>Statistical Neurodynamics of Deep Networks: Geometry of Signal Spaces.</w:t>
       </w:r>
     </w:p>
     <w:p>
@@ -2539,7 +2539,7 @@
         <w:ind w:left="432"/>
       </w:pPr>
       <w:r>
-        <w:t xml:space="preserve">Entropy, 20(3), 173. </w:t>
+        <w:t xml:space="preserve">Nonlinear Theory and Its Applications, IEICE, 10(4), 322-336. </w:t>
       </w:r>
       <w:hyperlink r:id="rId51">
         <w:r>
@@ -2560,7 +2560,7 @@
         <w:ind w:left="432" w:hanging="432"/>
       </w:pPr>
       <w:r>
-        <w:t>24. Shohei Hidaka, Masafumi Oizumi (2018)</w:t>
+        <w:t>25. Jun Kitazono, Ryota Kanai, Masafumi Oizumi (2018)</w:t>
       </w:r>
     </w:p>
     <w:p>
@@ -2571,7 +2571,7 @@
         <w:ind w:left="432"/>
       </w:pPr>
       <w:r>
-        <w:t>Fast and exact search for the partition with minimal information loss.</w:t>
+        <w:t>Efficient Algorithms for Searching the Minimum Information Partition in Integrated Information Theory.</w:t>
       </w:r>
     </w:p>
     <w:p>
@@ -2582,7 +2582,7 @@
         <w:ind w:left="432"/>
       </w:pPr>
       <w:r>
-        <w:t xml:space="preserve">PLoS ONE, 13(9), e0201126. </w:t>
+        <w:t xml:space="preserve">Entropy, 20(3), 173. </w:t>
       </w:r>
       <w:hyperlink r:id="rId52">
         <w:r>
@@ -2603,7 +2603,7 @@
         <w:ind w:left="432" w:hanging="432"/>
       </w:pPr>
       <w:r>
-        <w:t>23. Shun-ichi Amari, Ryo Karakida, Masafumi Oizumi (2018)</w:t>
+        <w:t>24. Shohei Hidaka, Masafumi Oizumi (2018)</w:t>
       </w:r>
     </w:p>
     <w:p>
@@ -2614,7 +2614,7 @@
         <w:ind w:left="432"/>
       </w:pPr>
       <w:r>
-        <w:t>Information Geometry Connecting Wasserstein Distance and Kullback-Leibler Divergence via the Entropy-Relaxed Transportation Problem.</w:t>
+        <w:t>Fast and exact search for the partition with minimal information loss.</w:t>
       </w:r>
     </w:p>
     <w:p>
@@ -2625,7 +2625,7 @@
         <w:ind w:left="432"/>
       </w:pPr>
       <w:r>
-        <w:t xml:space="preserve">Information Geometry, 1(1), 1-25. </w:t>
+        <w:t xml:space="preserve">PLoS ONE, 13(9), e0201126. </w:t>
       </w:r>
       <w:hyperlink r:id="rId53">
         <w:r>
@@ -2646,7 +2646,7 @@
         <w:ind w:left="432" w:hanging="432"/>
       </w:pPr>
       <w:r>
-        <w:t>22. Hiroki Mori, Masafumi Oizumi (2018)</w:t>
+        <w:t>23. Shun-ichi Amari, Ryo Karakida, Masafumi Oizumi (2018)</w:t>
       </w:r>
     </w:p>
     <w:p>
@@ -2657,7 +2657,7 @@
         <w:ind w:left="432"/>
       </w:pPr>
       <w:r>
-        <w:t>Information integration in a globally coupled chaotic system.</w:t>
+        <w:t>Information Geometry Connecting Wasserstein Distance and Kullback-Leibler Divergence via the Entropy-Relaxed Transportation Problem.</w:t>
       </w:r>
     </w:p>
     <w:p>
@@ -2668,7 +2668,7 @@
         <w:ind w:left="432"/>
       </w:pPr>
       <w:r>
-        <w:t xml:space="preserve">In The 2018 Conference on Artificial Life, 384-385. </w:t>
+        <w:t xml:space="preserve">Information Geometry, 1(1), 1-25. </w:t>
       </w:r>
       <w:hyperlink r:id="rId54">
         <w:r>
@@ -2689,7 +2689,7 @@
         <w:ind w:left="432" w:hanging="432"/>
       </w:pPr>
       <w:r>
-        <w:t>21. Andrew M. Haun, Masafumi Oizumi, Christopher K. Kovach, Hiroto Kawasaki, Hiroyuki Oya, Matthew A. Howard, Ralph Adolphs, Naotsugu Tsuchiya (2017)</w:t>
+        <w:t>22. Hiroki Mori, Masafumi Oizumi (2018)</w:t>
       </w:r>
     </w:p>
     <w:p>
@@ -2700,7 +2700,7 @@
         <w:ind w:left="432"/>
       </w:pPr>
       <w:r>
-        <w:t>Conscious Perception as Integrated Information Patterns in Human Electrocorticography.</w:t>
+        <w:t>Information integration in a globally coupled chaotic system.</w:t>
       </w:r>
     </w:p>
     <w:p>
@@ -2711,7 +2711,7 @@
         <w:ind w:left="432"/>
       </w:pPr>
       <w:r>
-        <w:t xml:space="preserve">eNeuro, 4(5), ENEURO.0085-17.2017. </w:t>
+        <w:t xml:space="preserve">In The 2018 Conference on Artificial Life, 384-385. </w:t>
       </w:r>
       <w:hyperlink r:id="rId55">
         <w:r>
@@ -2732,7 +2732,7 @@
         <w:ind w:left="432" w:hanging="432"/>
       </w:pPr>
       <w:r>
-        <w:t>20. Naotsugu Tsuchiya, Andrew Haun, Dror Cohen, Masafumi Oizumi (2016)</w:t>
+        <w:t>21. Andrew M. Haun, Masafumi Oizumi, Christopher K. Kovach, Hiroto Kawasaki, Hiroyuki Oya, Matthew A. Howard, Ralph Adolphs, Naotsugu Tsuchiya (2017)</w:t>
       </w:r>
     </w:p>
     <w:p>
@@ -2743,7 +2743,7 @@
         <w:ind w:left="432"/>
       </w:pPr>
       <w:r>
-        <w:t>Empirical tests of the integrated information theory of consciousness.</w:t>
+        <w:t>Conscious Perception as Integrated Information Patterns in Human Electrocorticography.</w:t>
       </w:r>
     </w:p>
     <w:p>
@@ -2754,40 +2754,7 @@
         <w:ind w:left="432"/>
       </w:pPr>
       <w:r>
-        <w:t>In The Return of Consciousness: A New Science on Old Questions, 349-374.</w:t>
-      </w:r>
-    </w:p>
-    <w:p>
-      <w:pPr>
-        <w:keepNext/>
-        <w:keepLines/>
-        <w:widowControl/>
-        <w:ind w:left="432" w:hanging="432"/>
-      </w:pPr>
-      <w:r>
-        <w:t>19. Shun-ichi Amari, Naotsugu Tsuchiya, Masafumi Oizumi (2016)</w:t>
-      </w:r>
-    </w:p>
-    <w:p>
-      <w:pPr>
-        <w:keepNext/>
-        <w:keepLines/>
-        <w:widowControl/>
-        <w:ind w:left="432"/>
-      </w:pPr>
-      <w:r>
-        <w:t>Geometry of information integration.</w:t>
-      </w:r>
-    </w:p>
-    <w:p>
-      <w:pPr>
-        <w:keepLines/>
-        <w:widowControl/>
-        <w:spacing w:after="240"/>
-        <w:ind w:left="432"/>
-      </w:pPr>
-      <w:r>
-        <w:t xml:space="preserve">Information Geometry and its Applications IV (pp. 3-17). Springer, Cham. </w:t>
+        <w:t xml:space="preserve">eNeuro, 4(5), ENEURO.0085-17.2017. </w:t>
       </w:r>
       <w:hyperlink r:id="rId56">
         <w:r>
@@ -2808,6 +2775,82 @@
         <w:ind w:left="432" w:hanging="432"/>
       </w:pPr>
       <w:r>
+        <w:t>20. Naotsugu Tsuchiya, Andrew Haun, Dror Cohen, Masafumi Oizumi (2016)</w:t>
+      </w:r>
+    </w:p>
+    <w:p>
+      <w:pPr>
+        <w:keepNext/>
+        <w:keepLines/>
+        <w:widowControl/>
+        <w:ind w:left="432"/>
+      </w:pPr>
+      <w:r>
+        <w:t>Empirical tests of the integrated information theory of consciousness.</w:t>
+      </w:r>
+    </w:p>
+    <w:p>
+      <w:pPr>
+        <w:keepLines/>
+        <w:widowControl/>
+        <w:spacing w:after="240"/>
+        <w:ind w:left="432"/>
+      </w:pPr>
+      <w:r>
+        <w:t>In The Return of Consciousness: A New Science on Old Questions, 349-374.</w:t>
+      </w:r>
+    </w:p>
+    <w:p>
+      <w:pPr>
+        <w:keepNext/>
+        <w:keepLines/>
+        <w:widowControl/>
+        <w:ind w:left="432" w:hanging="432"/>
+      </w:pPr>
+      <w:r>
+        <w:t>19. Shun-ichi Amari, Naotsugu Tsuchiya, Masafumi Oizumi (2016)</w:t>
+      </w:r>
+    </w:p>
+    <w:p>
+      <w:pPr>
+        <w:keepNext/>
+        <w:keepLines/>
+        <w:widowControl/>
+        <w:ind w:left="432"/>
+      </w:pPr>
+      <w:r>
+        <w:t>Geometry of information integration.</w:t>
+      </w:r>
+    </w:p>
+    <w:p>
+      <w:pPr>
+        <w:keepLines/>
+        <w:widowControl/>
+        <w:spacing w:after="240"/>
+        <w:ind w:left="432"/>
+      </w:pPr>
+      <w:r>
+        <w:t xml:space="preserve">Information Geometry and its Applications IV (pp. 3-17). Springer, Cham. </w:t>
+      </w:r>
+      <w:hyperlink r:id="rId57">
+        <w:r>
+          <w:rPr>
+            <w:color w:val="1155CC"/>
+            <w:u w:val="single"/>
+          </w:rPr>
+          <w:t>DOI</w:t>
+        </w:r>
+      </w:hyperlink>
+      <w:r/>
+    </w:p>
+    <w:p>
+      <w:pPr>
+        <w:keepNext/>
+        <w:keepLines/>
+        <w:widowControl/>
+        <w:ind w:left="432" w:hanging="432"/>
+      </w:pPr>
+      <w:r>
         <w:t>18. Masafumi Oizumi, Shun-ichi Amari, Toru Yanagawa, Naotaka Fujii, Naotsugu Tsuchiya (2016)</w:t>
       </w:r>
     </w:p>
@@ -2918,7 +2961,7 @@
       <w:r>
         <w:t xml:space="preserve">PLoS ONE, 10(5): e0125337. </w:t>
       </w:r>
-      <w:hyperlink r:id="rId57">
+      <w:hyperlink r:id="rId58">
         <w:r>
           <w:rPr>
             <w:color w:val="1155CC"/>
@@ -3004,49 +3047,6 @@
       <w:r>
         <w:t xml:space="preserve">PLoS ONE, 8, e59670. </w:t>
       </w:r>
-      <w:hyperlink r:id="rId58">
-        <w:r>
-          <w:rPr>
-            <w:color w:val="1155CC"/>
-            <w:u w:val="single"/>
-          </w:rPr>
-          <w:t>DOI</w:t>
-        </w:r>
-      </w:hyperlink>
-      <w:r/>
-    </w:p>
-    <w:p>
-      <w:pPr>
-        <w:keepNext/>
-        <w:keepLines/>
-        <w:widowControl/>
-        <w:ind w:left="432" w:hanging="432"/>
-      </w:pPr>
-      <w:r>
-        <w:t>13. Masafumi Oizumi, Ryota Satoh, Hokto Kazama, Masato Okada (2012)</w:t>
-      </w:r>
-    </w:p>
-    <w:p>
-      <w:pPr>
-        <w:keepNext/>
-        <w:keepLines/>
-        <w:widowControl/>
-        <w:ind w:left="432"/>
-      </w:pPr>
-      <w:r>
-        <w:t>Functional differences between global pre- and postsynaptic inhibition in the Drosophila olfactory circuit.</w:t>
-      </w:r>
-    </w:p>
-    <w:p>
-      <w:pPr>
-        <w:keepLines/>
-        <w:widowControl/>
-        <w:spacing w:after="240"/>
-        <w:ind w:left="432"/>
-      </w:pPr>
-      <w:r>
-        <w:t xml:space="preserve">Frontiers in Computational Neuroscience, 6:14. </w:t>
-      </w:r>
       <w:hyperlink r:id="rId59">
         <w:r>
           <w:rPr>
@@ -3066,7 +3066,7 @@
         <w:ind w:left="432" w:hanging="432"/>
       </w:pPr>
       <w:r>
-        <w:t>12. Yasuhiko Igarashi, Masafumi Oizumi, Masato Okada (2012)</w:t>
+        <w:t>13. Masafumi Oizumi, Ryota Satoh, Hokto Kazama, Masato Okada (2012)</w:t>
       </w:r>
     </w:p>
     <w:p>
@@ -3077,7 +3077,7 @@
         <w:ind w:left="432"/>
       </w:pPr>
       <w:r>
-        <w:t>Theory of correlation in a network with synaptic depression.</w:t>
+        <w:t>Functional differences between global pre- and postsynaptic inhibition in the Drosophila olfactory circuit.</w:t>
       </w:r>
     </w:p>
     <w:p>
@@ -3088,7 +3088,7 @@
         <w:ind w:left="432"/>
       </w:pPr>
       <w:r>
-        <w:t xml:space="preserve">Physical Review E 85, 016108. </w:t>
+        <w:t xml:space="preserve">Frontiers in Computational Neuroscience, 6:14. </w:t>
       </w:r>
       <w:hyperlink r:id="rId60">
         <w:r>
@@ -3109,7 +3109,7 @@
         <w:ind w:left="432" w:hanging="432"/>
       </w:pPr>
       <w:r>
-        <w:t>11. Yosuke Otsubo, Kenji Nagata, Masafumi Oizumi, and Masato Okada (2011)</w:t>
+        <w:t>12. Yasuhiko Igarashi, Masafumi Oizumi, Masato Okada (2012)</w:t>
       </w:r>
     </w:p>
     <w:p>
@@ -3120,7 +3120,7 @@
         <w:ind w:left="432"/>
       </w:pPr>
       <w:r>
-        <w:t>Influence of synaptic depression on memory storage capacity.</w:t>
+        <w:t>Theory of correlation in a network with synaptic depression.</w:t>
       </w:r>
     </w:p>
     <w:p>
@@ -3131,7 +3131,7 @@
         <w:ind w:left="432"/>
       </w:pPr>
       <w:r>
-        <w:t xml:space="preserve">Journal of the Physical Society of Japan, 80, 084004. </w:t>
+        <w:t xml:space="preserve">Physical Review E 85, 016108. </w:t>
       </w:r>
       <w:hyperlink r:id="rId61">
         <w:r>
@@ -3152,7 +3152,7 @@
         <w:ind w:left="432" w:hanging="432"/>
       </w:pPr>
       <w:r>
-        <w:t>10. Masafumi Oizumi, Masato Okada, Shun-ichi Amari (2011)</w:t>
+        <w:t>11. Yosuke Otsubo, Kenji Nagata, Masafumi Oizumi, and Masato Okada (2011)</w:t>
       </w:r>
     </w:p>
     <w:p>
@@ -3163,7 +3163,7 @@
         <w:ind w:left="432"/>
       </w:pPr>
       <w:r>
-        <w:t>Information loss associated with imperfect observation and mismatched decoding.</w:t>
+        <w:t>Influence of synaptic depression on memory storage capacity.</w:t>
       </w:r>
     </w:p>
     <w:p>
@@ -3174,7 +3174,7 @@
         <w:ind w:left="432"/>
       </w:pPr>
       <w:r>
-        <w:t xml:space="preserve">Frontiers in Computational Neuroscience, 5:9. </w:t>
+        <w:t xml:space="preserve">Journal of the Physical Society of Japan, 80, 084004. </w:t>
       </w:r>
       <w:hyperlink r:id="rId62">
         <w:r>
@@ -3195,7 +3195,7 @@
         <w:ind w:left="432" w:hanging="432"/>
       </w:pPr>
       <w:r>
-        <w:t>9. Masafumi Oizumi, Keiji Miura, Masato Okada (2010)</w:t>
+        <w:t>10. Masafumi Oizumi, Masato Okada, Shun-ichi Amari (2011)</w:t>
       </w:r>
     </w:p>
     <w:p>
@@ -3206,7 +3206,7 @@
         <w:ind w:left="432"/>
       </w:pPr>
       <w:r>
-        <w:t>Analytical investigation of the effects of lateral connections on the accuracy of population coding.</w:t>
+        <w:t>Information loss associated with imperfect observation and mismatched decoding.</w:t>
       </w:r>
     </w:p>
     <w:p>
@@ -3217,7 +3217,7 @@
         <w:ind w:left="432"/>
       </w:pPr>
       <w:r>
-        <w:t xml:space="preserve">Physical Review E, 81, 051905. </w:t>
+        <w:t xml:space="preserve">Frontiers in Computational Neuroscience, 5:9. </w:t>
       </w:r>
       <w:hyperlink r:id="rId63">
         <w:r>
@@ -3238,7 +3238,7 @@
         <w:ind w:left="432" w:hanging="432"/>
       </w:pPr>
       <w:r>
-        <w:t>8. Yosuke Otsubo, Kenji Nagata, Masafumi Oizumi, Masato Okada (2010)</w:t>
+        <w:t>9. Masafumi Oizumi, Keiji Miura, Masato Okada (2010)</w:t>
       </w:r>
     </w:p>
     <w:p>
@@ -3249,7 +3249,7 @@
         <w:ind w:left="432"/>
       </w:pPr>
       <w:r>
-        <w:t>Instabilities in associative memory model with synaptic depression and switching phenomena among attractors.</w:t>
+        <w:t>Analytical investigation of the effects of lateral connections on the accuracy of population coding.</w:t>
       </w:r>
     </w:p>
     <w:p>
@@ -3260,7 +3260,7 @@
         <w:ind w:left="432"/>
       </w:pPr>
       <w:r>
-        <w:t xml:space="preserve">Journal of the Physical Society of Japan, 79, 084002. </w:t>
+        <w:t xml:space="preserve">Physical Review E, 81, 051905. </w:t>
       </w:r>
       <w:hyperlink r:id="rId64">
         <w:r>
@@ -3281,7 +3281,7 @@
         <w:ind w:left="432" w:hanging="432"/>
       </w:pPr>
       <w:r>
-        <w:t>7. Yasuhiko Igarashi, Masafumi Oizumi, Masato Okada (2010)</w:t>
+        <w:t>8. Yosuke Otsubo, Kenji Nagata, Masafumi Oizumi, Masato Okada (2010)</w:t>
       </w:r>
     </w:p>
     <w:p>
@@ -3292,7 +3292,7 @@
         <w:ind w:left="432"/>
       </w:pPr>
       <w:r>
-        <w:t>Mean field analysis of stochastic neural network models with synaptic depression.</w:t>
+        <w:t>Instabilities in associative memory model with synaptic depression and switching phenomena among attractors.</w:t>
       </w:r>
     </w:p>
     <w:p>
@@ -3303,7 +3303,7 @@
         <w:ind w:left="432"/>
       </w:pPr>
       <w:r>
-        <w:t xml:space="preserve">Journal of the Physical Society of Japan, 79, 084001. </w:t>
+        <w:t xml:space="preserve">Journal of the Physical Society of Japan, 79, 084002. </w:t>
       </w:r>
       <w:hyperlink r:id="rId65">
         <w:r>
@@ -3324,7 +3324,7 @@
         <w:ind w:left="432" w:hanging="432"/>
       </w:pPr>
       <w:r>
-        <w:t>6. Ryota Satoh*, Masafumi Oizumi*, Hokto Kazama, Masato Okada (2010)</w:t>
+        <w:t>7. Yasuhiko Igarashi, Masafumi Oizumi, Masato Okada (2010)</w:t>
       </w:r>
     </w:p>
     <w:p>
@@ -3335,7 +3335,7 @@
         <w:ind w:left="432"/>
       </w:pPr>
       <w:r>
-        <w:t>Mechanisms of maximum information preservation in the Drosophila antennal lobe.</w:t>
+        <w:t>Mean field analysis of stochastic neural network models with synaptic depression.</w:t>
       </w:r>
     </w:p>
     <w:p>
@@ -3346,7 +3346,7 @@
         <w:ind w:left="432"/>
       </w:pPr>
       <w:r>
-        <w:t xml:space="preserve">PLoS ONE, 5, e10644, 2010. *: equal contribution </w:t>
+        <w:t xml:space="preserve">Journal of the Physical Society of Japan, 79, 084001. </w:t>
       </w:r>
       <w:hyperlink r:id="rId66">
         <w:r>
@@ -3367,6 +3367,49 @@
         <w:ind w:left="432" w:hanging="432"/>
       </w:pPr>
       <w:r>
+        <w:t>6. Ryota Satoh*, Masafumi Oizumi*, Hokto Kazama, Masato Okada (2010)</w:t>
+      </w:r>
+    </w:p>
+    <w:p>
+      <w:pPr>
+        <w:keepNext/>
+        <w:keepLines/>
+        <w:widowControl/>
+        <w:ind w:left="432"/>
+      </w:pPr>
+      <w:r>
+        <w:t>Mechanisms of maximum information preservation in the Drosophila antennal lobe.</w:t>
+      </w:r>
+    </w:p>
+    <w:p>
+      <w:pPr>
+        <w:keepLines/>
+        <w:widowControl/>
+        <w:spacing w:after="240"/>
+        <w:ind w:left="432"/>
+      </w:pPr>
+      <w:r>
+        <w:t xml:space="preserve">PLoS ONE, 5, e10644, 2010. *: equal contribution </w:t>
+      </w:r>
+      <w:hyperlink r:id="rId67">
+        <w:r>
+          <w:rPr>
+            <w:color w:val="1155CC"/>
+            <w:u w:val="single"/>
+          </w:rPr>
+          <w:t>DOI</w:t>
+        </w:r>
+      </w:hyperlink>
+      <w:r/>
+    </w:p>
+    <w:p>
+      <w:pPr>
+        <w:keepNext/>
+        <w:keepLines/>
+        <w:widowControl/>
+        <w:ind w:left="432" w:hanging="432"/>
+      </w:pPr>
+      <w:r>
         <w:t>5. Masafumi Oizumi, Toshiyuki Ishii, Kazuya Ishibashi, Toshihiko Hosoya, Masato Okada (2010)</w:t>
       </w:r>
     </w:p>
@@ -3434,49 +3477,6 @@
       <w:r>
         <w:t xml:space="preserve">Advances in Neural Information Processing Systems, 21, 1225-1232. </w:t>
       </w:r>
-      <w:hyperlink r:id="rId67">
-        <w:r>
-          <w:rPr>
-            <w:color w:val="1155CC"/>
-            <w:u w:val="single"/>
-          </w:rPr>
-          <w:t>DOI</w:t>
-        </w:r>
-      </w:hyperlink>
-      <w:r/>
-    </w:p>
-    <w:p>
-      <w:pPr>
-        <w:keepNext/>
-        <w:keepLines/>
-        <w:widowControl/>
-        <w:ind w:left="432" w:hanging="432"/>
-      </w:pPr>
-      <w:r>
-        <w:t>3. Yasuhiko Igarashi, Masafumi Oizumi, Yosuke Otsubo, Kenji Nagata, Masato Okada (2009)</w:t>
-      </w:r>
-    </w:p>
-    <w:p>
-      <w:pPr>
-        <w:keepNext/>
-        <w:keepLines/>
-        <w:widowControl/>
-        <w:ind w:left="432"/>
-      </w:pPr>
-      <w:r>
-        <w:t>Statistical mechanics of attractor neural network models with synaptic depression.</w:t>
-      </w:r>
-    </w:p>
-    <w:p>
-      <w:pPr>
-        <w:keepLines/>
-        <w:widowControl/>
-        <w:spacing w:after="240"/>
-        <w:ind w:left="432"/>
-      </w:pPr>
-      <w:r>
-        <w:t xml:space="preserve">Journal of Physics Conference Series, 197, 012018. </w:t>
-      </w:r>
       <w:hyperlink r:id="rId68">
         <w:r>
           <w:rPr>
@@ -3496,7 +3496,7 @@
         <w:ind w:left="432" w:hanging="432"/>
       </w:pPr>
       <w:r>
-        <w:t>2. Masafumi Oizumi, Yoichi Miyawaki, Masato Okada (2008)</w:t>
+        <w:t>3. Yasuhiko Igarashi, Masafumi Oizumi, Yosuke Otsubo, Kenji Nagata, Masato Okada (2009)</w:t>
       </w:r>
     </w:p>
     <w:p>
@@ -3507,7 +3507,7 @@
         <w:ind w:left="432"/>
       </w:pPr>
       <w:r>
-        <w:t>Rate reduction for associative memory model in Hodgkin-Huxley-type network.</w:t>
+        <w:t>Statistical mechanics of attractor neural network models with synaptic depression.</w:t>
       </w:r>
     </w:p>
     <w:p>
@@ -3518,7 +3518,7 @@
         <w:ind w:left="432"/>
       </w:pPr>
       <w:r>
-        <w:t xml:space="preserve">Journal of the Physical Society of Japan, 77(6), 064802. </w:t>
+        <w:t xml:space="preserve">Journal of Physics Conference Series, 197, 012018. </w:t>
       </w:r>
       <w:hyperlink r:id="rId69">
         <w:r>
@@ -3539,7 +3539,7 @@
         <w:ind w:left="432" w:hanging="432"/>
       </w:pPr>
       <w:r>
-        <w:t>1. Masafumi Oizumi, Yoichi Miyawaki, Masato Okada (2007)</w:t>
+        <w:t>2. Masafumi Oizumi, Yoichi Miyawaki, Masato Okada (2008)</w:t>
       </w:r>
     </w:p>
     <w:p>
@@ -3550,7 +3550,7 @@
         <w:ind w:left="432"/>
       </w:pPr>
       <w:r>
-        <w:t>Higher order effects on rate reduction for networks of Hodgkin-Huxley neurons.</w:t>
+        <w:t>Rate reduction for associative memory model in Hodgkin-Huxley-type network.</w:t>
       </w:r>
     </w:p>
     <w:p>
@@ -3561,7 +3561,7 @@
         <w:ind w:left="432"/>
       </w:pPr>
       <w:r>
-        <w:t xml:space="preserve">Journal of the Physical Society of Japan, 76(4), 044803. </w:t>
+        <w:t xml:space="preserve">Journal of the Physical Society of Japan, 77(6), 064802. </w:t>
       </w:r>
       <w:hyperlink r:id="rId70">
         <w:r>
@@ -3576,24 +3576,13 @@
     </w:p>
     <w:p>
       <w:pPr>
-        <w:pStyle w:val="Heading2"/>
-        <w:keepNext/>
-        <w:widowControl/>
-        <w:spacing w:before="280" w:after="200"/>
-      </w:pPr>
-      <w:r>
-        <w:t>Preprints</w:t>
-      </w:r>
-    </w:p>
-    <w:p>
-      <w:pPr>
         <w:keepNext/>
         <w:keepLines/>
         <w:widowControl/>
         <w:ind w:left="432" w:hanging="432"/>
       </w:pPr>
       <w:r>
-        <w:t>6. Mikito Ogino, Daiki Sekizawa, Jun Kitazono, and Masafumi Oizumi (2026)</w:t>
+        <w:t>1. Masafumi Oizumi, Yoichi Miyawaki, Masato Okada (2007)</w:t>
       </w:r>
     </w:p>
     <w:p>
@@ -3604,7 +3593,7 @@
         <w:ind w:left="432"/>
       </w:pPr>
       <w:r>
-        <w:t>Designing optimal perturbation inputs for system identification in neuroscience.</w:t>
+        <w:t>Higher order effects on rate reduction for networks of Hodgkin-Huxley neurons.</w:t>
       </w:r>
     </w:p>
     <w:p>
@@ -3615,7 +3604,7 @@
         <w:ind w:left="432"/>
       </w:pPr>
       <w:r>
-        <w:t xml:space="preserve">eLife, 15, RP110030 (reviewed preprint). </w:t>
+        <w:t xml:space="preserve">Journal of the Physical Society of Japan, 76(4), 044803. </w:t>
       </w:r>
       <w:hyperlink r:id="rId71">
         <w:r>
@@ -3627,6 +3616,17 @@
         </w:r>
       </w:hyperlink>
       <w:r/>
+    </w:p>
+    <w:p>
+      <w:pPr>
+        <w:pStyle w:val="Heading2"/>
+        <w:keepNext/>
+        <w:widowControl/>
+        <w:spacing w:before="280" w:after="200"/>
+      </w:pPr>
+      <w:r>
+        <w:t>Preprints</w:t>
+      </w:r>
     </w:p>
     <w:p>
       <w:pPr>

</xml_diff>